<commit_message>
Name Change, The rest are the same
</commit_message>
<xml_diff>
--- a/RMX_Report/LAB1_1_Potentiometer.docx
+++ b/RMX_Report/LAB1_1_Potentiometer.docx
@@ -260,7 +260,14 @@
           <w:b/>
           <w:bCs/>
         </w:rPr>
-        <w:t>.2</w:t>
+        <w:t>.</w:t>
+      </w:r>
+      <w:r>
+        <w:rPr>
+          <w:b/>
+          <w:bCs/>
+        </w:rPr>
+        <w:t>1</w:t>
       </w:r>
       <w:r>
         <w:rPr>
@@ -275,14 +282,7 @@
           <w:b/>
           <w:bCs/>
         </w:rPr>
-        <w:t xml:space="preserve">Incremental </w:t>
-      </w:r>
-      <w:r>
-        <w:rPr>
-          <w:b/>
-          <w:bCs/>
-        </w:rPr>
-        <w:t>Encoder</w:t>
+        <w:t>Potentiometer</w:t>
       </w:r>
     </w:p>
     <w:p>
@@ -670,7 +670,7 @@
           <w:szCs w:val="36"/>
           <w:cs/>
         </w:rPr>
-        <w:t xml:space="preserve">1.2: </w:t>
+        <w:t>1.</w:t>
       </w:r>
       <w:r>
         <w:rPr>
@@ -679,7 +679,26 @@
           <w:sz w:val="36"/>
           <w:szCs w:val="36"/>
         </w:rPr>
-        <w:t>Incremental Encoder</w:t>
+        <w:t>1</w:t>
+      </w:r>
+      <w:r>
+        <w:rPr>
+          <w:b/>
+          <w:bCs/>
+          <w:sz w:val="36"/>
+          <w:szCs w:val="36"/>
+          <w:cs/>
+        </w:rPr>
+        <w:t xml:space="preserve">: </w:t>
+      </w:r>
+      <w:r>
+        <w:rPr>
+          <w:b/>
+          <w:bCs/>
+          <w:sz w:val="36"/>
+          <w:szCs w:val="36"/>
+        </w:rPr>
+        <w:t>Potentiometer</w:t>
       </w:r>
     </w:p>
     <w:p>
@@ -738,27 +757,7 @@
           <w:sz w:val="36"/>
           <w:szCs w:val="36"/>
         </w:rPr>
-        <w:t xml:space="preserve">TH </w:t>
-      </w:r>
-      <w:proofErr w:type="spellStart"/>
-      <w:r>
-        <w:rPr>
-          <w:b/>
-          <w:bCs/>
-          <w:sz w:val="36"/>
-          <w:szCs w:val="36"/>
-        </w:rPr>
-        <w:t>Sarabun</w:t>
-      </w:r>
-      <w:proofErr w:type="spellEnd"/>
-      <w:r>
-        <w:rPr>
-          <w:b/>
-          <w:bCs/>
-          <w:sz w:val="36"/>
-          <w:szCs w:val="36"/>
-        </w:rPr>
-        <w:t xml:space="preserve"> New</w:t>
+        <w:t>TH Sarabun New</w:t>
       </w:r>
       <w:r>
         <w:rPr>
@@ -863,23 +862,7 @@
           <w:sz w:val="36"/>
           <w:szCs w:val="36"/>
         </w:rPr>
-        <w:t xml:space="preserve">(TH </w:t>
-      </w:r>
-      <w:proofErr w:type="spellStart"/>
-      <w:r>
-        <w:rPr>
-          <w:sz w:val="36"/>
-          <w:szCs w:val="36"/>
-        </w:rPr>
-        <w:t>Sarabun</w:t>
-      </w:r>
-      <w:proofErr w:type="spellEnd"/>
-      <w:r>
-        <w:rPr>
-          <w:sz w:val="36"/>
-          <w:szCs w:val="36"/>
-        </w:rPr>
-        <w:t xml:space="preserve"> New, 16)</w:t>
+        <w:t>(TH Sarabun New, 16)</w:t>
       </w:r>
     </w:p>
     <w:p>
@@ -9021,10 +9004,23 @@
 </file>
 
 <file path=customXml/item1.xml><?xml version="1.0" encoding="utf-8"?>
-<b:Sources xmlns:b="http://schemas.openxmlformats.org/officeDocument/2006/bibliography" xmlns="http://schemas.openxmlformats.org/officeDocument/2006/bibliography" SelectedStyle="\APASixthEditionOfficeOnline.xsl" StyleName="APA" Version="6"/>
+<p:properties xmlns:p="http://schemas.microsoft.com/office/2006/metadata/properties" xmlns:xsi="http://www.w3.org/2001/XMLSchema-instance" xmlns:pc="http://schemas.microsoft.com/office/infopath/2007/PartnerControls">
+  <documentManagement>
+    <_activity xmlns="659e3b7d-26b7-4d13-811e-1b8fc95c3522" xsi:nil="true"/>
+  </documentManagement>
+</p:properties>
 </file>
 
 <file path=customXml/item2.xml><?xml version="1.0" encoding="utf-8"?>
+<?mso-contentType ?>
+<FormTemplates xmlns="http://schemas.microsoft.com/sharepoint/v3/contenttype/forms">
+  <Display>DocumentLibraryForm</Display>
+  <Edit>DocumentLibraryForm</Edit>
+  <New>DocumentLibraryForm</New>
+</FormTemplates>
+</file>
+
+<file path=customXml/item3.xml><?xml version="1.0" encoding="utf-8"?>
 <ct:contentTypeSchema xmlns:ct="http://schemas.microsoft.com/office/2006/metadata/contentType" xmlns:ma="http://schemas.microsoft.com/office/2006/metadata/properties/metaAttributes" ct:_="" ma:_="" ma:contentTypeName="เอกสาร" ma:contentTypeID="0x010100EC5770EA766D9B40988FA670E28603CF" ma:contentTypeVersion="6" ma:contentTypeDescription="สร้างเอกสารใหม่" ma:contentTypeScope="" ma:versionID="a2f7d1d28ad95e979bb7613b0a62b43d">
   <xsd:schema xmlns:xsd="http://www.w3.org/2001/XMLSchema" xmlns:xs="http://www.w3.org/2001/XMLSchema" xmlns:p="http://schemas.microsoft.com/office/2006/metadata/properties" xmlns:ns3="659e3b7d-26b7-4d13-811e-1b8fc95c3522" targetNamespace="http://schemas.microsoft.com/office/2006/metadata/properties" ma:root="true" ma:fieldsID="f5a1f06c3c85eab79d41b016a8c71d93" ns3:_="">
     <xsd:import namespace="659e3b7d-26b7-4d13-811e-1b8fc95c3522"/>
@@ -9180,32 +9176,29 @@
 </ct:contentTypeSchema>
 </file>
 
-<file path=customXml/item3.xml><?xml version="1.0" encoding="utf-8"?>
-<?mso-contentType ?>
-<FormTemplates xmlns="http://schemas.microsoft.com/sharepoint/v3/contenttype/forms">
-  <Display>DocumentLibraryForm</Display>
-  <Edit>DocumentLibraryForm</Edit>
-  <New>DocumentLibraryForm</New>
-</FormTemplates>
-</file>
-
 <file path=customXml/item4.xml><?xml version="1.0" encoding="utf-8"?>
-<p:properties xmlns:p="http://schemas.microsoft.com/office/2006/metadata/properties" xmlns:xsi="http://www.w3.org/2001/XMLSchema-instance" xmlns:pc="http://schemas.microsoft.com/office/infopath/2007/PartnerControls">
-  <documentManagement>
-    <_activity xmlns="659e3b7d-26b7-4d13-811e-1b8fc95c3522" xsi:nil="true"/>
-  </documentManagement>
-</p:properties>
+<b:Sources xmlns:b="http://schemas.openxmlformats.org/officeDocument/2006/bibliography" xmlns="http://schemas.openxmlformats.org/officeDocument/2006/bibliography" SelectedStyle="\APASixthEditionOfficeOnline.xsl" StyleName="APA" Version="6"/>
 </file>
 
 <file path=customXml/itemProps1.xml><?xml version="1.0" encoding="utf-8"?>
-<ds:datastoreItem xmlns:ds="http://schemas.openxmlformats.org/officeDocument/2006/customXml" ds:itemID="{95FB0139-A545-47E0-8C35-69BE14593E77}">
+<ds:datastoreItem xmlns:ds="http://schemas.openxmlformats.org/officeDocument/2006/customXml" ds:itemID="{965345DC-B869-4FF8-A296-EBD1A94E682D}">
   <ds:schemaRefs>
-    <ds:schemaRef ds:uri="http://schemas.openxmlformats.org/officeDocument/2006/bibliography"/>
+    <ds:schemaRef ds:uri="http://schemas.microsoft.com/office/2006/metadata/properties"/>
+    <ds:schemaRef ds:uri="http://schemas.microsoft.com/office/infopath/2007/PartnerControls"/>
+    <ds:schemaRef ds:uri="659e3b7d-26b7-4d13-811e-1b8fc95c3522"/>
   </ds:schemaRefs>
 </ds:datastoreItem>
 </file>
 
 <file path=customXml/itemProps2.xml><?xml version="1.0" encoding="utf-8"?>
+<ds:datastoreItem xmlns:ds="http://schemas.openxmlformats.org/officeDocument/2006/customXml" ds:itemID="{FB6E50C7-B161-410D-82A0-50E58A6390FA}">
+  <ds:schemaRefs>
+    <ds:schemaRef ds:uri="http://schemas.microsoft.com/sharepoint/v3/contenttype/forms"/>
+  </ds:schemaRefs>
+</ds:datastoreItem>
+</file>
+
+<file path=customXml/itemProps3.xml><?xml version="1.0" encoding="utf-8"?>
 <ds:datastoreItem xmlns:ds="http://schemas.openxmlformats.org/officeDocument/2006/customXml" ds:itemID="{859C7C01-9563-471E-B3EA-8AE60E6050F7}">
   <ds:schemaRefs>
     <ds:schemaRef ds:uri="http://schemas.microsoft.com/office/2006/metadata/contentType"/>
@@ -9223,20 +9216,10 @@
 </ds:datastoreItem>
 </file>
 
-<file path=customXml/itemProps3.xml><?xml version="1.0" encoding="utf-8"?>
-<ds:datastoreItem xmlns:ds="http://schemas.openxmlformats.org/officeDocument/2006/customXml" ds:itemID="{FB6E50C7-B161-410D-82A0-50E58A6390FA}">
+<file path=customXml/itemProps4.xml><?xml version="1.0" encoding="utf-8"?>
+<ds:datastoreItem xmlns:ds="http://schemas.openxmlformats.org/officeDocument/2006/customXml" ds:itemID="{95FB0139-A545-47E0-8C35-69BE14593E77}">
   <ds:schemaRefs>
-    <ds:schemaRef ds:uri="http://schemas.microsoft.com/sharepoint/v3/contenttype/forms"/>
-  </ds:schemaRefs>
-</ds:datastoreItem>
-</file>
-
-<file path=customXml/itemProps4.xml><?xml version="1.0" encoding="utf-8"?>
-<ds:datastoreItem xmlns:ds="http://schemas.openxmlformats.org/officeDocument/2006/customXml" ds:itemID="{965345DC-B869-4FF8-A296-EBD1A94E682D}">
-  <ds:schemaRefs>
-    <ds:schemaRef ds:uri="http://schemas.microsoft.com/office/2006/metadata/properties"/>
-    <ds:schemaRef ds:uri="http://schemas.microsoft.com/office/infopath/2007/PartnerControls"/>
-    <ds:schemaRef ds:uri="659e3b7d-26b7-4d13-811e-1b8fc95c3522"/>
+    <ds:schemaRef ds:uri="http://schemas.openxmlformats.org/officeDocument/2006/bibliography"/>
   </ds:schemaRefs>
 </ds:datastoreItem>
 </file>
</xml_diff>

<commit_message>
Final Push Jing Jing Na
Jing jinjg plkeaese
</commit_message>
<xml_diff>
--- a/RMX_Report/LAB1_1_Potentiometer.docx
+++ b/RMX_Report/LAB1_1_Potentiometer.docx
@@ -435,7 +435,7 @@
     </w:p>
     <w:p>
       <w:pPr>
-        <w:pStyle w:val="a1"/>
+        <w:pStyle w:val="ListParagraph"/>
         <w:spacing w:before="0"/>
         <w:ind w:left="714" w:hanging="357"/>
         <w:rPr>
@@ -478,7 +478,7 @@
     </w:p>
     <w:p>
       <w:pPr>
-        <w:pStyle w:val="a1"/>
+        <w:pStyle w:val="ListParagraph"/>
         <w:spacing w:before="0"/>
         <w:ind w:left="714" w:hanging="357"/>
         <w:rPr>
@@ -512,7 +512,7 @@
     </w:p>
     <w:p>
       <w:pPr>
-        <w:pStyle w:val="a1"/>
+        <w:pStyle w:val="ListParagraph"/>
         <w:spacing w:before="0"/>
         <w:ind w:left="714" w:hanging="357"/>
         <w:rPr>
@@ -553,7 +553,7 @@
     </w:p>
     <w:p>
       <w:pPr>
-        <w:pStyle w:val="a1"/>
+        <w:pStyle w:val="ListParagraph"/>
         <w:spacing w:before="0"/>
         <w:ind w:left="714" w:hanging="357"/>
         <w:rPr>
@@ -762,7 +762,7 @@
     </w:p>
     <w:p>
       <w:pPr>
-        <w:pStyle w:val="a1"/>
+        <w:pStyle w:val="ListParagraph"/>
         <w:numPr>
           <w:ilvl w:val="2"/>
           <w:numId w:val="99"/>
@@ -1442,7 +1442,7 @@
     </w:p>
     <w:p>
       <w:pPr>
-        <w:pStyle w:val="a1"/>
+        <w:pStyle w:val="ListParagraph"/>
         <w:numPr>
           <w:ilvl w:val="2"/>
           <w:numId w:val="99"/>
@@ -1875,7 +1875,7 @@
     </w:p>
     <w:p>
       <w:pPr>
-        <w:pStyle w:val="a1"/>
+        <w:pStyle w:val="ListParagraph"/>
         <w:numPr>
           <w:ilvl w:val="2"/>
           <w:numId w:val="99"/>
@@ -2153,7 +2153,6 @@
         <w:ind w:firstLine="720"/>
         <w:jc w:val="thaiDistribute"/>
         <w:rPr>
-          <w:rFonts w:hint="cs"/>
           <w:cs/>
         </w:rPr>
       </w:pPr>
@@ -2336,7 +2335,7 @@
     </w:p>
     <w:p>
       <w:pPr>
-        <w:pStyle w:val="a1"/>
+        <w:pStyle w:val="ListParagraph"/>
         <w:numPr>
           <w:ilvl w:val="0"/>
           <w:numId w:val="89"/>
@@ -2375,7 +2374,7 @@
     </w:p>
     <w:p>
       <w:pPr>
-        <w:pStyle w:val="a1"/>
+        <w:pStyle w:val="ListParagraph"/>
         <w:numPr>
           <w:ilvl w:val="0"/>
           <w:numId w:val="89"/>
@@ -2432,7 +2431,7 @@
     </w:p>
     <w:p>
       <w:pPr>
-        <w:pStyle w:val="a1"/>
+        <w:pStyle w:val="ListParagraph"/>
         <w:numPr>
           <w:ilvl w:val="0"/>
           <w:numId w:val="66"/>
@@ -2496,7 +2495,7 @@
     </w:p>
     <w:p>
       <w:pPr>
-        <w:pStyle w:val="a1"/>
+        <w:pStyle w:val="ListParagraph"/>
         <w:numPr>
           <w:ilvl w:val="0"/>
           <w:numId w:val="66"/>
@@ -2564,7 +2563,7 @@
     </w:p>
     <w:p>
       <w:pPr>
-        <w:pStyle w:val="a1"/>
+        <w:pStyle w:val="ListParagraph"/>
         <w:numPr>
           <w:ilvl w:val="0"/>
           <w:numId w:val="66"/>
@@ -2663,7 +2662,7 @@
     </w:p>
     <w:p>
       <w:pPr>
-        <w:pStyle w:val="a1"/>
+        <w:pStyle w:val="ListParagraph"/>
         <w:numPr>
           <w:ilvl w:val="0"/>
           <w:numId w:val="90"/>
@@ -2686,7 +2685,7 @@
     </w:p>
     <w:p>
       <w:pPr>
-        <w:pStyle w:val="a1"/>
+        <w:pStyle w:val="ListParagraph"/>
         <w:numPr>
           <w:ilvl w:val="0"/>
           <w:numId w:val="74"/>
@@ -2714,7 +2713,7 @@
     </w:p>
     <w:p>
       <w:pPr>
-        <w:pStyle w:val="a1"/>
+        <w:pStyle w:val="ListParagraph"/>
         <w:numPr>
           <w:ilvl w:val="0"/>
           <w:numId w:val="74"/>
@@ -2743,7 +2742,7 @@
     </w:p>
     <w:p>
       <w:pPr>
-        <w:pStyle w:val="a1"/>
+        <w:pStyle w:val="ListParagraph"/>
         <w:numPr>
           <w:ilvl w:val="0"/>
           <w:numId w:val="90"/>
@@ -2977,7 +2976,7 @@
     </w:p>
     <w:p>
       <w:pPr>
-        <w:pStyle w:val="a1"/>
+        <w:pStyle w:val="ListParagraph"/>
         <w:numPr>
           <w:ilvl w:val="0"/>
           <w:numId w:val="92"/>
@@ -3075,7 +3074,7 @@
     </w:p>
     <w:p>
       <w:pPr>
-        <w:pStyle w:val="a1"/>
+        <w:pStyle w:val="ListParagraph"/>
         <w:numPr>
           <w:ilvl w:val="0"/>
           <w:numId w:val="92"/>
@@ -3103,7 +3102,7 @@
     </w:p>
     <w:p>
       <w:pPr>
-        <w:pStyle w:val="a1"/>
+        <w:pStyle w:val="ListParagraph"/>
         <w:numPr>
           <w:ilvl w:val="0"/>
           <w:numId w:val="92"/>
@@ -3176,7 +3175,7 @@
     </w:p>
     <w:p>
       <w:pPr>
-        <w:pStyle w:val="a1"/>
+        <w:pStyle w:val="ListParagraph"/>
         <w:numPr>
           <w:ilvl w:val="0"/>
           <w:numId w:val="92"/>
@@ -3234,7 +3233,7 @@
     </w:p>
     <w:p>
       <w:pPr>
-        <w:pStyle w:val="a1"/>
+        <w:pStyle w:val="ListParagraph"/>
         <w:numPr>
           <w:ilvl w:val="0"/>
           <w:numId w:val="92"/>
@@ -3303,7 +3302,7 @@
     </w:p>
     <w:p>
       <w:pPr>
-        <w:pStyle w:val="a1"/>
+        <w:pStyle w:val="ListParagraph"/>
         <w:numPr>
           <w:ilvl w:val="0"/>
           <w:numId w:val="92"/>
@@ -3345,7 +3344,7 @@
     </w:p>
     <w:p>
       <w:pPr>
-        <w:pStyle w:val="a1"/>
+        <w:pStyle w:val="ListParagraph"/>
         <w:numPr>
           <w:ilvl w:val="0"/>
           <w:numId w:val="75"/>
@@ -3575,7 +3574,7 @@
     </w:p>
     <w:p>
       <w:pPr>
-        <w:pStyle w:val="a1"/>
+        <w:pStyle w:val="ListParagraph"/>
         <w:numPr>
           <w:ilvl w:val="0"/>
           <w:numId w:val="75"/>
@@ -3729,7 +3728,7 @@
     </w:p>
     <w:p>
       <w:pPr>
-        <w:pStyle w:val="a1"/>
+        <w:pStyle w:val="ListParagraph"/>
         <w:numPr>
           <w:ilvl w:val="0"/>
           <w:numId w:val="75"/>
@@ -4143,7 +4142,7 @@
     </w:p>
     <w:p>
       <w:pPr>
-        <w:pStyle w:val="a1"/>
+        <w:pStyle w:val="ListParagraph"/>
         <w:numPr>
           <w:ilvl w:val="2"/>
           <w:numId w:val="100"/>
@@ -4166,7 +4165,7 @@
     </w:p>
     <w:p>
       <w:pPr>
-        <w:pStyle w:val="a1"/>
+        <w:pStyle w:val="ListParagraph"/>
         <w:numPr>
           <w:ilvl w:val="2"/>
           <w:numId w:val="100"/>
@@ -4219,7 +4218,7 @@
     </w:p>
     <w:p>
       <w:pPr>
-        <w:pStyle w:val="a1"/>
+        <w:pStyle w:val="ListParagraph"/>
         <w:numPr>
           <w:ilvl w:val="2"/>
           <w:numId w:val="104"/>
@@ -4257,7 +4256,7 @@
     </w:p>
     <w:p>
       <w:pPr>
-        <w:pStyle w:val="a1"/>
+        <w:pStyle w:val="ListParagraph"/>
         <w:numPr>
           <w:ilvl w:val="2"/>
           <w:numId w:val="104"/>
@@ -4295,7 +4294,7 @@
     </w:p>
     <w:p>
       <w:pPr>
-        <w:pStyle w:val="a1"/>
+        <w:pStyle w:val="ListParagraph"/>
         <w:numPr>
           <w:ilvl w:val="2"/>
           <w:numId w:val="104"/>
@@ -4352,7 +4351,7 @@
     </w:p>
     <w:p>
       <w:pPr>
-        <w:pStyle w:val="a1"/>
+        <w:pStyle w:val="ListParagraph"/>
         <w:numPr>
           <w:ilvl w:val="2"/>
           <w:numId w:val="105"/>
@@ -4430,7 +4429,7 @@
     </w:p>
     <w:p>
       <w:pPr>
-        <w:pStyle w:val="a1"/>
+        <w:pStyle w:val="ListParagraph"/>
         <w:numPr>
           <w:ilvl w:val="2"/>
           <w:numId w:val="105"/>
@@ -4634,7 +4633,7 @@
     </w:p>
     <w:p>
       <w:pPr>
-        <w:pStyle w:val="a1"/>
+        <w:pStyle w:val="ListParagraph"/>
         <w:numPr>
           <w:ilvl w:val="0"/>
           <w:numId w:val="97"/>
@@ -4732,7 +4731,7 @@
     </w:p>
     <w:p>
       <w:pPr>
-        <w:pStyle w:val="a1"/>
+        <w:pStyle w:val="ListParagraph"/>
         <w:numPr>
           <w:ilvl w:val="0"/>
           <w:numId w:val="97"/>
@@ -4760,7 +4759,7 @@
     </w:p>
     <w:p>
       <w:pPr>
-        <w:pStyle w:val="a1"/>
+        <w:pStyle w:val="ListParagraph"/>
         <w:numPr>
           <w:ilvl w:val="0"/>
           <w:numId w:val="97"/>
@@ -4811,7 +4810,7 @@
     </w:p>
     <w:p>
       <w:pPr>
-        <w:pStyle w:val="a1"/>
+        <w:pStyle w:val="ListParagraph"/>
         <w:numPr>
           <w:ilvl w:val="0"/>
           <w:numId w:val="97"/>
@@ -4862,7 +4861,7 @@
     </w:p>
     <w:p>
       <w:pPr>
-        <w:pStyle w:val="a1"/>
+        <w:pStyle w:val="ListParagraph"/>
         <w:numPr>
           <w:ilvl w:val="0"/>
           <w:numId w:val="97"/>
@@ -4883,7 +4882,7 @@
     </w:p>
     <w:p>
       <w:pPr>
-        <w:pStyle w:val="a1"/>
+        <w:pStyle w:val="ListParagraph"/>
         <w:numPr>
           <w:ilvl w:val="0"/>
           <w:numId w:val="97"/>
@@ -4925,7 +4924,7 @@
     </w:p>
     <w:p>
       <w:pPr>
-        <w:pStyle w:val="a1"/>
+        <w:pStyle w:val="ListParagraph"/>
         <w:numPr>
           <w:ilvl w:val="0"/>
           <w:numId w:val="98"/>
@@ -5101,7 +5100,7 @@
     </w:p>
     <w:p>
       <w:pPr>
-        <w:pStyle w:val="a1"/>
+        <w:pStyle w:val="ListParagraph"/>
         <w:numPr>
           <w:ilvl w:val="0"/>
           <w:numId w:val="98"/>
@@ -5732,7 +5731,7 @@
     </w:p>
     <w:tbl>
       <w:tblPr>
-        <w:tblStyle w:val="af2"/>
+        <w:tblStyle w:val="TableGrid"/>
         <w:tblW w:w="4536" w:type="dxa"/>
         <w:jc w:val="center"/>
         <w:tblLook w:val="04A0" w:firstRow="1" w:lastRow="0" w:firstColumn="1" w:lastColumn="0" w:noHBand="0" w:noVBand="1"/>
@@ -6277,7 +6276,7 @@
     </w:p>
     <w:tbl>
       <w:tblPr>
-        <w:tblStyle w:val="af2"/>
+        <w:tblStyle w:val="TableGrid"/>
         <w:tblW w:w="4536" w:type="dxa"/>
         <w:jc w:val="center"/>
         <w:tblLook w:val="04A0" w:firstRow="1" w:lastRow="0" w:firstColumn="1" w:lastColumn="0" w:noHBand="0" w:noVBand="1"/>
@@ -6856,7 +6855,7 @@
     </w:p>
     <w:tbl>
       <w:tblPr>
-        <w:tblStyle w:val="af2"/>
+        <w:tblStyle w:val="TableGrid"/>
         <w:tblW w:w="4536" w:type="dxa"/>
         <w:jc w:val="center"/>
         <w:tblLook w:val="04A0" w:firstRow="1" w:lastRow="0" w:firstColumn="1" w:lastColumn="0" w:noHBand="0" w:noVBand="1"/>
@@ -7397,7 +7396,7 @@
     </w:p>
     <w:tbl>
       <w:tblPr>
-        <w:tblStyle w:val="af2"/>
+        <w:tblStyle w:val="TableGrid"/>
         <w:tblW w:w="4536" w:type="dxa"/>
         <w:jc w:val="center"/>
         <w:tblLook w:val="04A0" w:firstRow="1" w:lastRow="0" w:firstColumn="1" w:lastColumn="0" w:noHBand="0" w:noVBand="1"/>
@@ -7751,7 +7750,7 @@
     </w:p>
     <w:tbl>
       <w:tblPr>
-        <w:tblStyle w:val="af2"/>
+        <w:tblStyle w:val="TableGrid"/>
         <w:tblW w:w="4536" w:type="dxa"/>
         <w:jc w:val="center"/>
         <w:tblLook w:val="04A0" w:firstRow="1" w:lastRow="0" w:firstColumn="1" w:lastColumn="0" w:noHBand="0" w:noVBand="1"/>
@@ -8105,7 +8104,7 @@
     </w:p>
     <w:p>
       <w:pPr>
-        <w:pStyle w:val="a1"/>
+        <w:pStyle w:val="ListParagraph"/>
       </w:pPr>
       <w:r>
         <w:t>Potentiometer: Definition, Types, And Working Principle</w:t>
@@ -8120,7 +8119,7 @@
       <w:hyperlink r:id="rId21" w:history="1">
         <w:r>
           <w:rPr>
-            <w:rStyle w:val="af0"/>
+            <w:rStyle w:val="Hyperlink"/>
           </w:rPr>
           <w:t>https://www.electrical4u.com/potentiometer/</w:t>
         </w:r>
@@ -8128,7 +8127,7 @@
     </w:p>
     <w:p>
       <w:pPr>
-        <w:pStyle w:val="a1"/>
+        <w:pStyle w:val="ListParagraph"/>
       </w:pPr>
       <w:r>
         <w:t>What is Schmitt Trigger | How It Works</w:t>
@@ -8143,7 +8142,7 @@
       <w:hyperlink r:id="rId22" w:history="1">
         <w:r>
           <w:rPr>
-            <w:rStyle w:val="af0"/>
+            <w:rStyle w:val="Hyperlink"/>
           </w:rPr>
           <w:t>https://howtomechatronics.com/how-it-works/electrical-engineering/schmitt-trigger/</w:t>
         </w:r>
@@ -8151,7 +8150,7 @@
     </w:p>
     <w:p>
       <w:pPr>
-        <w:pStyle w:val="a1"/>
+        <w:pStyle w:val="ListParagraph"/>
       </w:pPr>
       <w:r>
         <w:t>Analog to Digital Conversion</w:t>
@@ -8166,7 +8165,7 @@
       <w:hyperlink r:id="rId23" w:history="1">
         <w:r>
           <w:rPr>
-            <w:rStyle w:val="af0"/>
+            <w:rStyle w:val="Hyperlink"/>
           </w:rPr>
           <w:t>https://learn.sparkfun.com/tutorials/analog-to-digital-conversion/relating-adc-value-to-voltage</w:t>
         </w:r>
@@ -8174,7 +8173,7 @@
     </w:p>
     <w:p>
       <w:pPr>
-        <w:pStyle w:val="a1"/>
+        <w:pStyle w:val="ListParagraph"/>
         <w:rPr>
           <w:sz w:val="28"/>
           <w:szCs w:val="28"/>
@@ -8193,7 +8192,7 @@
       <w:hyperlink r:id="rId24" w:history="1">
         <w:r>
           <w:rPr>
-            <w:rStyle w:val="af0"/>
+            <w:rStyle w:val="Hyperlink"/>
           </w:rPr>
           <w:t>https://www.mouser.com/datasheet/3/40/1/pta.pdf</w:t>
         </w:r>
@@ -8208,7 +8207,7 @@
       <w:hyperlink r:id="rId25" w:history="1">
         <w:r>
           <w:rPr>
-            <w:rStyle w:val="af0"/>
+            <w:rStyle w:val="Hyperlink"/>
           </w:rPr>
           <w:t>https://www.mouser.com/datasheet/3/40/1/PDB18.pdf</w:t>
         </w:r>
@@ -8281,7 +8280,7 @@
     <w:sdtContent>
       <w:p>
         <w:pPr>
-          <w:pStyle w:val="af8"/>
+          <w:pStyle w:val="Footer"/>
           <w:jc w:val="right"/>
         </w:pPr>
         <w:r>
@@ -8326,7 +8325,7 @@
   </w:sdt>
   <w:p>
     <w:pPr>
-      <w:pStyle w:val="af8"/>
+      <w:pStyle w:val="Footer"/>
       <w:rPr>
         <w:sz w:val="28"/>
         <w:szCs w:val="36"/>
@@ -8365,17 +8364,17 @@
 <w:hdr xmlns:wpc="http://schemas.microsoft.com/office/word/2010/wordprocessingCanvas" xmlns:cx="http://schemas.microsoft.com/office/drawing/2014/chartex" xmlns:cx1="http://schemas.microsoft.com/office/drawing/2015/9/8/chartex" xmlns:cx2="http://schemas.microsoft.com/office/drawing/2015/10/21/chartex" xmlns:cx3="http://schemas.microsoft.com/office/drawing/2016/5/9/chartex" xmlns:cx4="http://schemas.microsoft.com/office/drawing/2016/5/10/chartex" xmlns:cx5="http://schemas.microsoft.com/office/drawing/2016/5/11/chartex" xmlns:cx6="http://schemas.microsoft.com/office/drawing/2016/5/12/chartex" xmlns:cx7="http://schemas.microsoft.com/office/drawing/2016/5/13/chartex" xmlns:cx8="http://schemas.microsoft.com/office/drawing/2016/5/14/chartex" xmlns:mc="http://schemas.openxmlformats.org/markup-compatibility/2006" xmlns:aink="http://schemas.microsoft.com/office/drawing/2016/ink" xmlns:am3d="http://schemas.microsoft.com/office/drawing/2017/model3d" xmlns:o="urn:schemas-microsoft-com:office:office" xmlns:oel="http://schemas.microsoft.com/office/2019/extlst" xmlns:r="http://schemas.openxmlformats.org/officeDocument/2006/relationships" xmlns:m="http://schemas.openxmlformats.org/officeDocument/2006/math" xmlns:v="urn:schemas-microsoft-com:vml" xmlns:wp14="http://schemas.microsoft.com/office/word/2010/wordprocessingDrawing" xmlns:wp="http://schemas.openxmlformats.org/drawingml/2006/wordprocessingDrawing" xmlns:w10="urn:schemas-microsoft-com:office:word" xmlns:w="http://schemas.openxmlformats.org/wordprocessingml/2006/main" xmlns:w14="http://schemas.microsoft.com/office/word/2010/wordml" xmlns:w15="http://schemas.microsoft.com/office/word/2012/wordml" xmlns:w16cex="http://schemas.microsoft.com/office/word/2018/wordml/cex" xmlns:w16cid="http://schemas.microsoft.com/office/word/2016/wordml/cid" xmlns:w16="http://schemas.microsoft.com/office/word/2018/wordml" xmlns:w16du="http://schemas.microsoft.com/office/word/2023/wordml/word16du" xmlns:w16sdtdh="http://schemas.microsoft.com/office/word/2020/wordml/sdtdatahash" xmlns:w16sdtfl="http://schemas.microsoft.com/office/word/2024/wordml/sdtformatlock" xmlns:w16se="http://schemas.microsoft.com/office/word/2015/wordml/symex" xmlns:wpg="http://schemas.microsoft.com/office/word/2010/wordprocessingGroup" xmlns:wpi="http://schemas.microsoft.com/office/word/2010/wordprocessingInk" xmlns:wne="http://schemas.microsoft.com/office/word/2006/wordml" xmlns:wps="http://schemas.microsoft.com/office/word/2010/wordprocessingShape" mc:Ignorable="w14 w15 w16se w16cid w16 w16cex w16sdtdh w16sdtfl w16du wp14">
   <w:p>
     <w:pPr>
-      <w:pStyle w:val="af6"/>
+      <w:pStyle w:val="Header"/>
     </w:pPr>
   </w:p>
   <w:p>
     <w:pPr>
-      <w:pStyle w:val="af6"/>
+      <w:pStyle w:val="Header"/>
     </w:pPr>
   </w:p>
   <w:p>
     <w:pPr>
-      <w:pStyle w:val="af6"/>
+      <w:pStyle w:val="Header"/>
     </w:pPr>
   </w:p>
 </w:hdr>
@@ -8390,7 +8389,7 @@
     <w:lvl w:ilvl="0">
       <w:start w:val="1"/>
       <w:numFmt w:val="decimal"/>
-      <w:pStyle w:val="5"/>
+      <w:pStyle w:val="ListNumber5"/>
       <w:lvlText w:val="%1."/>
       <w:lvlJc w:val="left"/>
       <w:pPr>
@@ -8408,7 +8407,7 @@
     <w:lvl w:ilvl="0">
       <w:start w:val="1"/>
       <w:numFmt w:val="decimal"/>
-      <w:pStyle w:val="4"/>
+      <w:pStyle w:val="ListNumber4"/>
       <w:lvlText w:val="%1."/>
       <w:lvlJc w:val="left"/>
       <w:pPr>
@@ -8426,7 +8425,7 @@
     <w:lvl w:ilvl="0">
       <w:start w:val="1"/>
       <w:numFmt w:val="decimal"/>
-      <w:pStyle w:val="3"/>
+      <w:pStyle w:val="ListNumber3"/>
       <w:lvlText w:val="%1."/>
       <w:lvlJc w:val="left"/>
       <w:pPr>
@@ -8444,7 +8443,7 @@
     <w:lvl w:ilvl="0">
       <w:start w:val="1"/>
       <w:numFmt w:val="decimal"/>
-      <w:pStyle w:val="2"/>
+      <w:pStyle w:val="ListNumber2"/>
       <w:lvlText w:val="%1."/>
       <w:lvlJc w:val="left"/>
       <w:pPr>
@@ -8462,7 +8461,7 @@
     <w:lvl w:ilvl="0">
       <w:start w:val="1"/>
       <w:numFmt w:val="bullet"/>
-      <w:pStyle w:val="50"/>
+      <w:pStyle w:val="ListBullet5"/>
       <w:lvlText w:val=""/>
       <w:lvlJc w:val="left"/>
       <w:pPr>
@@ -8483,7 +8482,7 @@
     <w:lvl w:ilvl="0">
       <w:start w:val="1"/>
       <w:numFmt w:val="bullet"/>
-      <w:pStyle w:val="40"/>
+      <w:pStyle w:val="ListBullet4"/>
       <w:lvlText w:val=""/>
       <w:lvlJc w:val="left"/>
       <w:pPr>
@@ -8504,7 +8503,7 @@
     <w:lvl w:ilvl="0">
       <w:start w:val="1"/>
       <w:numFmt w:val="bullet"/>
-      <w:pStyle w:val="30"/>
+      <w:pStyle w:val="ListBullet3"/>
       <w:lvlText w:val=""/>
       <w:lvlJc w:val="left"/>
       <w:pPr>
@@ -8525,7 +8524,7 @@
     <w:lvl w:ilvl="0">
       <w:start w:val="1"/>
       <w:numFmt w:val="bullet"/>
-      <w:pStyle w:val="20"/>
+      <w:pStyle w:val="ListBullet2"/>
       <w:lvlText w:val=""/>
       <w:lvlJc w:val="left"/>
       <w:pPr>
@@ -8546,7 +8545,7 @@
     <w:lvl w:ilvl="0">
       <w:start w:val="1"/>
       <w:numFmt w:val="decimal"/>
-      <w:pStyle w:val="a"/>
+      <w:pStyle w:val="ListNumber"/>
       <w:lvlText w:val="%1."/>
       <w:lvlJc w:val="left"/>
       <w:pPr>
@@ -8564,7 +8563,7 @@
     <w:lvl w:ilvl="0">
       <w:start w:val="1"/>
       <w:numFmt w:val="bullet"/>
-      <w:pStyle w:val="a0"/>
+      <w:pStyle w:val="ListBullet"/>
       <w:lvlText w:val=""/>
       <w:lvlJc w:val="left"/>
       <w:pPr>
@@ -9905,7 +9904,7 @@
     <w:lvl w:ilvl="0">
       <w:start w:val="1"/>
       <w:numFmt w:val="bullet"/>
-      <w:pStyle w:val="a1"/>
+      <w:pStyle w:val="ListParagraph"/>
       <w:lvlText w:val=""/>
       <w:lvlJc w:val="left"/>
       <w:pPr>
@@ -17068,16 +17067,16 @@
     <w:lsdException w:name="Unresolved Mention" w:semiHidden="1" w:unhideWhenUsed="1"/>
     <w:lsdException w:name="Smart Link" w:semiHidden="1" w:unhideWhenUsed="1"/>
   </w:latentStyles>
-  <w:style w:type="paragraph" w:default="1" w:styleId="a2">
+  <w:style w:type="paragraph" w:default="1" w:styleId="Normal">
     <w:name w:val="Normal"/>
     <w:qFormat/>
     <w:rsid w:val="00304B3D"/>
   </w:style>
-  <w:style w:type="paragraph" w:styleId="1">
+  <w:style w:type="paragraph" w:styleId="Heading1">
     <w:name w:val="heading 1"/>
-    <w:basedOn w:val="a2"/>
-    <w:next w:val="a2"/>
-    <w:link w:val="10"/>
+    <w:basedOn w:val="Normal"/>
+    <w:next w:val="Normal"/>
+    <w:link w:val="Heading1Char"/>
     <w:uiPriority w:val="9"/>
     <w:qFormat/>
     <w:rsid w:val="00281AE6"/>
@@ -17094,11 +17093,11 @@
       <w:szCs w:val="50"/>
     </w:rPr>
   </w:style>
-  <w:style w:type="paragraph" w:styleId="21">
+  <w:style w:type="paragraph" w:styleId="Heading2">
     <w:name w:val="heading 2"/>
-    <w:basedOn w:val="a2"/>
-    <w:next w:val="a2"/>
-    <w:link w:val="22"/>
+    <w:basedOn w:val="Normal"/>
+    <w:next w:val="Normal"/>
+    <w:link w:val="Heading2Char"/>
     <w:uiPriority w:val="9"/>
     <w:semiHidden/>
     <w:unhideWhenUsed/>
@@ -17116,11 +17115,11 @@
       <w:szCs w:val="40"/>
     </w:rPr>
   </w:style>
-  <w:style w:type="paragraph" w:styleId="31">
+  <w:style w:type="paragraph" w:styleId="Heading3">
     <w:name w:val="heading 3"/>
-    <w:basedOn w:val="a2"/>
-    <w:next w:val="a2"/>
-    <w:link w:val="32"/>
+    <w:basedOn w:val="Normal"/>
+    <w:next w:val="Normal"/>
+    <w:link w:val="Heading3Char"/>
     <w:uiPriority w:val="9"/>
     <w:semiHidden/>
     <w:unhideWhenUsed/>
@@ -17139,11 +17138,11 @@
       <w:szCs w:val="35"/>
     </w:rPr>
   </w:style>
-  <w:style w:type="paragraph" w:styleId="41">
+  <w:style w:type="paragraph" w:styleId="Heading4">
     <w:name w:val="heading 4"/>
-    <w:basedOn w:val="a2"/>
-    <w:next w:val="a2"/>
-    <w:link w:val="42"/>
+    <w:basedOn w:val="Normal"/>
+    <w:next w:val="Normal"/>
+    <w:link w:val="Heading4Char"/>
     <w:uiPriority w:val="9"/>
     <w:semiHidden/>
     <w:unhideWhenUsed/>
@@ -17163,11 +17162,11 @@
       <w:szCs w:val="40"/>
     </w:rPr>
   </w:style>
-  <w:style w:type="paragraph" w:styleId="51">
+  <w:style w:type="paragraph" w:styleId="Heading5">
     <w:name w:val="heading 5"/>
-    <w:basedOn w:val="a2"/>
-    <w:next w:val="a2"/>
-    <w:link w:val="52"/>
+    <w:basedOn w:val="Normal"/>
+    <w:next w:val="Normal"/>
+    <w:link w:val="Heading5Char"/>
     <w:uiPriority w:val="9"/>
     <w:semiHidden/>
     <w:unhideWhenUsed/>
@@ -17185,11 +17184,11 @@
       <w:szCs w:val="40"/>
     </w:rPr>
   </w:style>
-  <w:style w:type="paragraph" w:styleId="6">
+  <w:style w:type="paragraph" w:styleId="Heading6">
     <w:name w:val="heading 6"/>
-    <w:basedOn w:val="a2"/>
-    <w:next w:val="a2"/>
-    <w:link w:val="60"/>
+    <w:basedOn w:val="Normal"/>
+    <w:next w:val="Normal"/>
+    <w:link w:val="Heading6Char"/>
     <w:uiPriority w:val="9"/>
     <w:semiHidden/>
     <w:unhideWhenUsed/>
@@ -17209,11 +17208,11 @@
       <w:szCs w:val="40"/>
     </w:rPr>
   </w:style>
-  <w:style w:type="paragraph" w:styleId="7">
+  <w:style w:type="paragraph" w:styleId="Heading7">
     <w:name w:val="heading 7"/>
-    <w:basedOn w:val="a2"/>
-    <w:next w:val="a2"/>
-    <w:link w:val="70"/>
+    <w:basedOn w:val="Normal"/>
+    <w:next w:val="Normal"/>
+    <w:link w:val="Heading7Char"/>
     <w:uiPriority w:val="9"/>
     <w:semiHidden/>
     <w:unhideWhenUsed/>
@@ -17231,11 +17230,11 @@
       <w:szCs w:val="40"/>
     </w:rPr>
   </w:style>
-  <w:style w:type="paragraph" w:styleId="8">
+  <w:style w:type="paragraph" w:styleId="Heading8">
     <w:name w:val="heading 8"/>
-    <w:basedOn w:val="a2"/>
-    <w:next w:val="a2"/>
-    <w:link w:val="80"/>
+    <w:basedOn w:val="Normal"/>
+    <w:next w:val="Normal"/>
+    <w:link w:val="Heading8Char"/>
     <w:uiPriority w:val="9"/>
     <w:semiHidden/>
     <w:unhideWhenUsed/>
@@ -17255,11 +17254,11 @@
       <w:szCs w:val="40"/>
     </w:rPr>
   </w:style>
-  <w:style w:type="paragraph" w:styleId="9">
+  <w:style w:type="paragraph" w:styleId="Heading9">
     <w:name w:val="heading 9"/>
-    <w:basedOn w:val="a2"/>
-    <w:next w:val="a2"/>
-    <w:link w:val="90"/>
+    <w:basedOn w:val="Normal"/>
+    <w:next w:val="Normal"/>
+    <w:link w:val="Heading9Char"/>
     <w:uiPriority w:val="9"/>
     <w:semiHidden/>
     <w:unhideWhenUsed/>
@@ -17277,13 +17276,13 @@
       <w:szCs w:val="40"/>
     </w:rPr>
   </w:style>
-  <w:style w:type="character" w:default="1" w:styleId="a3">
+  <w:style w:type="character" w:default="1" w:styleId="DefaultParagraphFont">
     <w:name w:val="Default Paragraph Font"/>
     <w:uiPriority w:val="1"/>
     <w:semiHidden/>
     <w:unhideWhenUsed/>
   </w:style>
-  <w:style w:type="table" w:default="1" w:styleId="a4">
+  <w:style w:type="table" w:default="1" w:styleId="TableNormal">
     <w:name w:val="Normal Table"/>
     <w:uiPriority w:val="99"/>
     <w:semiHidden/>
@@ -17298,16 +17297,16 @@
       </w:tblCellMar>
     </w:tblPr>
   </w:style>
-  <w:style w:type="numbering" w:default="1" w:styleId="a5">
+  <w:style w:type="numbering" w:default="1" w:styleId="NoList">
     <w:name w:val="No List"/>
     <w:uiPriority w:val="99"/>
     <w:semiHidden/>
     <w:unhideWhenUsed/>
   </w:style>
-  <w:style w:type="character" w:customStyle="1" w:styleId="10">
-    <w:name w:val="หัวเรื่อง 1 อักขระ"/>
-    <w:basedOn w:val="a3"/>
-    <w:link w:val="1"/>
+  <w:style w:type="character" w:customStyle="1" w:styleId="Heading1Char">
+    <w:name w:val="Heading 1 Char"/>
+    <w:basedOn w:val="DefaultParagraphFont"/>
+    <w:link w:val="Heading1"/>
     <w:uiPriority w:val="9"/>
     <w:rsid w:val="00281AE6"/>
     <w:rPr>
@@ -17317,10 +17316,10 @@
       <w:szCs w:val="50"/>
     </w:rPr>
   </w:style>
-  <w:style w:type="character" w:customStyle="1" w:styleId="22">
-    <w:name w:val="หัวเรื่อง 2 อักขระ"/>
-    <w:basedOn w:val="a3"/>
-    <w:link w:val="21"/>
+  <w:style w:type="character" w:customStyle="1" w:styleId="Heading2Char">
+    <w:name w:val="Heading 2 Char"/>
+    <w:basedOn w:val="DefaultParagraphFont"/>
+    <w:link w:val="Heading2"/>
     <w:uiPriority w:val="9"/>
     <w:semiHidden/>
     <w:rsid w:val="00281AE6"/>
@@ -17330,10 +17329,10 @@
       <w:szCs w:val="40"/>
     </w:rPr>
   </w:style>
-  <w:style w:type="character" w:customStyle="1" w:styleId="32">
-    <w:name w:val="หัวเรื่อง 3 อักขระ"/>
-    <w:basedOn w:val="a3"/>
-    <w:link w:val="31"/>
+  <w:style w:type="character" w:customStyle="1" w:styleId="Heading3Char">
+    <w:name w:val="Heading 3 Char"/>
+    <w:basedOn w:val="DefaultParagraphFont"/>
+    <w:link w:val="Heading3"/>
     <w:uiPriority w:val="9"/>
     <w:semiHidden/>
     <w:rsid w:val="00281AE6"/>
@@ -17344,10 +17343,10 @@
       <w:szCs w:val="35"/>
     </w:rPr>
   </w:style>
-  <w:style w:type="character" w:customStyle="1" w:styleId="42">
-    <w:name w:val="หัวเรื่อง 4 อักขระ"/>
-    <w:basedOn w:val="a3"/>
-    <w:link w:val="41"/>
+  <w:style w:type="character" w:customStyle="1" w:styleId="Heading4Char">
+    <w:name w:val="Heading 4 Char"/>
+    <w:basedOn w:val="DefaultParagraphFont"/>
+    <w:link w:val="Heading4"/>
     <w:uiPriority w:val="9"/>
     <w:semiHidden/>
     <w:rsid w:val="00281AE6"/>
@@ -17359,10 +17358,10 @@
       <w:szCs w:val="40"/>
     </w:rPr>
   </w:style>
-  <w:style w:type="character" w:customStyle="1" w:styleId="52">
-    <w:name w:val="หัวเรื่อง 5 อักขระ"/>
-    <w:basedOn w:val="a3"/>
-    <w:link w:val="51"/>
+  <w:style w:type="character" w:customStyle="1" w:styleId="Heading5Char">
+    <w:name w:val="Heading 5 Char"/>
+    <w:basedOn w:val="DefaultParagraphFont"/>
+    <w:link w:val="Heading5"/>
     <w:uiPriority w:val="9"/>
     <w:semiHidden/>
     <w:rsid w:val="00281AE6"/>
@@ -17372,10 +17371,10 @@
       <w:szCs w:val="40"/>
     </w:rPr>
   </w:style>
-  <w:style w:type="character" w:customStyle="1" w:styleId="60">
-    <w:name w:val="หัวเรื่อง 6 อักขระ"/>
-    <w:basedOn w:val="a3"/>
-    <w:link w:val="6"/>
+  <w:style w:type="character" w:customStyle="1" w:styleId="Heading6Char">
+    <w:name w:val="Heading 6 Char"/>
+    <w:basedOn w:val="DefaultParagraphFont"/>
+    <w:link w:val="Heading6"/>
     <w:uiPriority w:val="9"/>
     <w:semiHidden/>
     <w:rsid w:val="00281AE6"/>
@@ -17387,10 +17386,10 @@
       <w:szCs w:val="40"/>
     </w:rPr>
   </w:style>
-  <w:style w:type="character" w:customStyle="1" w:styleId="70">
-    <w:name w:val="หัวเรื่อง 7 อักขระ"/>
-    <w:basedOn w:val="a3"/>
-    <w:link w:val="7"/>
+  <w:style w:type="character" w:customStyle="1" w:styleId="Heading7Char">
+    <w:name w:val="Heading 7 Char"/>
+    <w:basedOn w:val="DefaultParagraphFont"/>
+    <w:link w:val="Heading7"/>
     <w:uiPriority w:val="9"/>
     <w:semiHidden/>
     <w:rsid w:val="00281AE6"/>
@@ -17400,10 +17399,10 @@
       <w:szCs w:val="40"/>
     </w:rPr>
   </w:style>
-  <w:style w:type="character" w:customStyle="1" w:styleId="80">
-    <w:name w:val="หัวเรื่อง 8 อักขระ"/>
-    <w:basedOn w:val="a3"/>
-    <w:link w:val="8"/>
+  <w:style w:type="character" w:customStyle="1" w:styleId="Heading8Char">
+    <w:name w:val="Heading 8 Char"/>
+    <w:basedOn w:val="DefaultParagraphFont"/>
+    <w:link w:val="Heading8"/>
     <w:uiPriority w:val="9"/>
     <w:semiHidden/>
     <w:rsid w:val="00281AE6"/>
@@ -17415,10 +17414,10 @@
       <w:szCs w:val="40"/>
     </w:rPr>
   </w:style>
-  <w:style w:type="character" w:customStyle="1" w:styleId="90">
-    <w:name w:val="หัวเรื่อง 9 อักขระ"/>
-    <w:basedOn w:val="a3"/>
-    <w:link w:val="9"/>
+  <w:style w:type="character" w:customStyle="1" w:styleId="Heading9Char">
+    <w:name w:val="Heading 9 Char"/>
+    <w:basedOn w:val="DefaultParagraphFont"/>
+    <w:link w:val="Heading9"/>
     <w:uiPriority w:val="9"/>
     <w:semiHidden/>
     <w:rsid w:val="00281AE6"/>
@@ -17428,11 +17427,11 @@
       <w:szCs w:val="40"/>
     </w:rPr>
   </w:style>
-  <w:style w:type="paragraph" w:styleId="a6">
+  <w:style w:type="paragraph" w:styleId="Title">
     <w:name w:val="Title"/>
-    <w:basedOn w:val="a2"/>
-    <w:next w:val="a2"/>
-    <w:link w:val="a7"/>
+    <w:basedOn w:val="Normal"/>
+    <w:next w:val="Normal"/>
+    <w:link w:val="TitleChar"/>
     <w:uiPriority w:val="10"/>
     <w:qFormat/>
     <w:rsid w:val="00281AE6"/>
@@ -17448,10 +17447,10 @@
       <w:szCs w:val="71"/>
     </w:rPr>
   </w:style>
-  <w:style w:type="character" w:customStyle="1" w:styleId="a7">
-    <w:name w:val="ชื่อเรื่อง อักขระ"/>
-    <w:basedOn w:val="a3"/>
-    <w:link w:val="a6"/>
+  <w:style w:type="character" w:customStyle="1" w:styleId="TitleChar">
+    <w:name w:val="Title Char"/>
+    <w:basedOn w:val="DefaultParagraphFont"/>
+    <w:link w:val="Title"/>
     <w:uiPriority w:val="10"/>
     <w:rsid w:val="00281AE6"/>
     <w:rPr>
@@ -17462,11 +17461,11 @@
       <w:szCs w:val="71"/>
     </w:rPr>
   </w:style>
-  <w:style w:type="paragraph" w:styleId="a8">
+  <w:style w:type="paragraph" w:styleId="Subtitle">
     <w:name w:val="Subtitle"/>
-    <w:basedOn w:val="a2"/>
-    <w:next w:val="a2"/>
-    <w:link w:val="a9"/>
+    <w:basedOn w:val="Normal"/>
+    <w:next w:val="Normal"/>
+    <w:link w:val="SubtitleChar"/>
     <w:uiPriority w:val="11"/>
     <w:qFormat/>
     <w:rsid w:val="00281AE6"/>
@@ -17483,10 +17482,10 @@
       <w:szCs w:val="35"/>
     </w:rPr>
   </w:style>
-  <w:style w:type="character" w:customStyle="1" w:styleId="a9">
-    <w:name w:val="ชื่อเรื่องรอง อักขระ"/>
-    <w:basedOn w:val="a3"/>
-    <w:link w:val="a8"/>
+  <w:style w:type="character" w:customStyle="1" w:styleId="SubtitleChar">
+    <w:name w:val="Subtitle Char"/>
+    <w:basedOn w:val="DefaultParagraphFont"/>
+    <w:link w:val="Subtitle"/>
     <w:uiPriority w:val="11"/>
     <w:rsid w:val="00281AE6"/>
     <w:rPr>
@@ -17497,11 +17496,11 @@
       <w:szCs w:val="35"/>
     </w:rPr>
   </w:style>
-  <w:style w:type="paragraph" w:styleId="aa">
+  <w:style w:type="paragraph" w:styleId="Quote">
     <w:name w:val="Quote"/>
-    <w:basedOn w:val="a2"/>
-    <w:next w:val="a2"/>
-    <w:link w:val="ab"/>
+    <w:basedOn w:val="Normal"/>
+    <w:next w:val="Normal"/>
+    <w:link w:val="QuoteChar"/>
     <w:uiPriority w:val="29"/>
     <w:qFormat/>
     <w:rsid w:val="00281AE6"/>
@@ -17517,10 +17516,10 @@
       <w:szCs w:val="40"/>
     </w:rPr>
   </w:style>
-  <w:style w:type="character" w:customStyle="1" w:styleId="ab">
-    <w:name w:val="คำอ้างอิง อักขระ"/>
-    <w:basedOn w:val="a3"/>
-    <w:link w:val="aa"/>
+  <w:style w:type="character" w:customStyle="1" w:styleId="QuoteChar">
+    <w:name w:val="Quote Char"/>
+    <w:basedOn w:val="DefaultParagraphFont"/>
+    <w:link w:val="Quote"/>
     <w:uiPriority w:val="29"/>
     <w:rsid w:val="00281AE6"/>
     <w:rPr>
@@ -17531,9 +17530,9 @@
       <w:szCs w:val="40"/>
     </w:rPr>
   </w:style>
-  <w:style w:type="paragraph" w:styleId="a1">
+  <w:style w:type="paragraph" w:styleId="ListParagraph">
     <w:name w:val="List Paragraph"/>
-    <w:basedOn w:val="a2"/>
+    <w:basedOn w:val="Normal"/>
     <w:autoRedefine/>
     <w:uiPriority w:val="34"/>
     <w:qFormat/>
@@ -17552,9 +17551,9 @@
       <w:bCs/>
     </w:rPr>
   </w:style>
-  <w:style w:type="character" w:styleId="ac">
+  <w:style w:type="character" w:styleId="IntenseEmphasis">
     <w:name w:val="Intense Emphasis"/>
-    <w:basedOn w:val="a3"/>
+    <w:basedOn w:val="DefaultParagraphFont"/>
     <w:uiPriority w:val="21"/>
     <w:qFormat/>
     <w:rsid w:val="00444E8D"/>
@@ -17566,11 +17565,11 @@
       <w:sz w:val="32"/>
     </w:rPr>
   </w:style>
-  <w:style w:type="paragraph" w:styleId="ad">
+  <w:style w:type="paragraph" w:styleId="IntenseQuote">
     <w:name w:val="Intense Quote"/>
-    <w:basedOn w:val="a2"/>
-    <w:next w:val="a2"/>
-    <w:link w:val="ae"/>
+    <w:basedOn w:val="Normal"/>
+    <w:next w:val="Normal"/>
+    <w:link w:val="IntenseQuoteChar"/>
     <w:uiPriority w:val="30"/>
     <w:qFormat/>
     <w:rsid w:val="00281AE6"/>
@@ -17591,10 +17590,10 @@
       <w:szCs w:val="40"/>
     </w:rPr>
   </w:style>
-  <w:style w:type="character" w:customStyle="1" w:styleId="ae">
-    <w:name w:val="ทำให้คำอ้างอิงเป็นสีเข้มขึ้น อักขระ"/>
-    <w:basedOn w:val="a3"/>
-    <w:link w:val="ad"/>
+  <w:style w:type="character" w:customStyle="1" w:styleId="IntenseQuoteChar">
+    <w:name w:val="Intense Quote Char"/>
+    <w:basedOn w:val="DefaultParagraphFont"/>
+    <w:link w:val="IntenseQuote"/>
     <w:uiPriority w:val="30"/>
     <w:rsid w:val="00281AE6"/>
     <w:rPr>
@@ -17605,9 +17604,9 @@
       <w:szCs w:val="40"/>
     </w:rPr>
   </w:style>
-  <w:style w:type="character" w:styleId="af">
+  <w:style w:type="character" w:styleId="IntenseReference">
     <w:name w:val="Intense Reference"/>
-    <w:basedOn w:val="a3"/>
+    <w:basedOn w:val="DefaultParagraphFont"/>
     <w:uiPriority w:val="32"/>
     <w:qFormat/>
     <w:rsid w:val="00281AE6"/>
@@ -17619,9 +17618,9 @@
       <w:spacing w:val="5"/>
     </w:rPr>
   </w:style>
-  <w:style w:type="character" w:styleId="af0">
+  <w:style w:type="character" w:styleId="Hyperlink">
     <w:name w:val="Hyperlink"/>
-    <w:basedOn w:val="a3"/>
+    <w:basedOn w:val="DefaultParagraphFont"/>
     <w:uiPriority w:val="99"/>
     <w:unhideWhenUsed/>
     <w:rsid w:val="00F3759E"/>
@@ -17630,9 +17629,9 @@
       <w:u w:val="single"/>
     </w:rPr>
   </w:style>
-  <w:style w:type="character" w:styleId="af1">
+  <w:style w:type="character" w:styleId="UnresolvedMention">
     <w:name w:val="Unresolved Mention"/>
-    <w:basedOn w:val="a3"/>
+    <w:basedOn w:val="DefaultParagraphFont"/>
     <w:uiPriority w:val="99"/>
     <w:semiHidden/>
     <w:unhideWhenUsed/>
@@ -17642,9 +17641,9 @@
       <w:shd w:val="clear" w:color="auto" w:fill="E1DFDD"/>
     </w:rPr>
   </w:style>
-  <w:style w:type="table" w:styleId="af2">
+  <w:style w:type="table" w:styleId="TableGrid">
     <w:name w:val="Table Grid"/>
-    <w:basedOn w:val="a4"/>
+    <w:basedOn w:val="TableNormal"/>
     <w:uiPriority w:val="39"/>
     <w:rsid w:val="004F25EF"/>
     <w:pPr>
@@ -17661,7 +17660,7 @@
       </w:tblBorders>
     </w:tblPr>
   </w:style>
-  <w:style w:type="paragraph" w:styleId="af3">
+  <w:style w:type="paragraph" w:styleId="Revision">
     <w:name w:val="Revision"/>
     <w:hidden/>
     <w:uiPriority w:val="99"/>
@@ -17675,9 +17674,9 @@
       <w:szCs w:val="40"/>
     </w:rPr>
   </w:style>
-  <w:style w:type="character" w:styleId="af4">
+  <w:style w:type="character" w:styleId="PlaceholderText">
     <w:name w:val="Placeholder Text"/>
-    <w:basedOn w:val="a3"/>
+    <w:basedOn w:val="DefaultParagraphFont"/>
     <w:uiPriority w:val="99"/>
     <w:semiHidden/>
     <w:rsid w:val="00A35043"/>
@@ -17685,9 +17684,9 @@
       <w:color w:val="666666"/>
     </w:rPr>
   </w:style>
-  <w:style w:type="character" w:styleId="af5">
+  <w:style w:type="character" w:styleId="FollowedHyperlink">
     <w:name w:val="FollowedHyperlink"/>
-    <w:basedOn w:val="a3"/>
+    <w:basedOn w:val="DefaultParagraphFont"/>
     <w:uiPriority w:val="99"/>
     <w:semiHidden/>
     <w:unhideWhenUsed/>
@@ -17697,10 +17696,10 @@
       <w:u w:val="single"/>
     </w:rPr>
   </w:style>
-  <w:style w:type="paragraph" w:styleId="af6">
+  <w:style w:type="paragraph" w:styleId="Header">
     <w:name w:val="header"/>
-    <w:basedOn w:val="a2"/>
-    <w:link w:val="af7"/>
+    <w:basedOn w:val="Normal"/>
+    <w:link w:val="HeaderChar"/>
     <w:uiPriority w:val="99"/>
     <w:unhideWhenUsed/>
     <w:rsid w:val="00644C28"/>
@@ -17716,10 +17715,10 @@
       <w:szCs w:val="40"/>
     </w:rPr>
   </w:style>
-  <w:style w:type="character" w:customStyle="1" w:styleId="af7">
-    <w:name w:val="หัวกระดาษ อักขระ"/>
-    <w:basedOn w:val="a3"/>
-    <w:link w:val="af6"/>
+  <w:style w:type="character" w:customStyle="1" w:styleId="HeaderChar">
+    <w:name w:val="Header Char"/>
+    <w:basedOn w:val="DefaultParagraphFont"/>
+    <w:link w:val="Header"/>
     <w:uiPriority w:val="99"/>
     <w:rsid w:val="00644C28"/>
     <w:rPr>
@@ -17727,10 +17726,10 @@
       <w:szCs w:val="40"/>
     </w:rPr>
   </w:style>
-  <w:style w:type="paragraph" w:styleId="af8">
+  <w:style w:type="paragraph" w:styleId="Footer">
     <w:name w:val="footer"/>
-    <w:basedOn w:val="a2"/>
-    <w:link w:val="af9"/>
+    <w:basedOn w:val="Normal"/>
+    <w:link w:val="FooterChar"/>
     <w:uiPriority w:val="99"/>
     <w:unhideWhenUsed/>
     <w:rsid w:val="00644C28"/>
@@ -17746,10 +17745,10 @@
       <w:szCs w:val="40"/>
     </w:rPr>
   </w:style>
-  <w:style w:type="character" w:customStyle="1" w:styleId="af9">
-    <w:name w:val="ท้ายกระดาษ อักขระ"/>
-    <w:basedOn w:val="a3"/>
-    <w:link w:val="af8"/>
+  <w:style w:type="character" w:customStyle="1" w:styleId="FooterChar">
+    <w:name w:val="Footer Char"/>
+    <w:basedOn w:val="DefaultParagraphFont"/>
+    <w:link w:val="Footer"/>
     <w:uiPriority w:val="99"/>
     <w:rsid w:val="00644C28"/>
     <w:rPr>
@@ -17757,10 +17756,10 @@
       <w:szCs w:val="40"/>
     </w:rPr>
   </w:style>
-  <w:style w:type="paragraph" w:styleId="afa">
+  <w:style w:type="paragraph" w:styleId="BalloonText">
     <w:name w:val="Balloon Text"/>
-    <w:basedOn w:val="a2"/>
-    <w:link w:val="afb"/>
+    <w:basedOn w:val="Normal"/>
+    <w:link w:val="BalloonTextChar"/>
     <w:uiPriority w:val="99"/>
     <w:semiHidden/>
     <w:unhideWhenUsed/>
@@ -17774,10 +17773,10 @@
       <w:szCs w:val="22"/>
     </w:rPr>
   </w:style>
-  <w:style w:type="character" w:customStyle="1" w:styleId="afb">
-    <w:name w:val="ข้อความบอลลูน อักขระ"/>
-    <w:basedOn w:val="a3"/>
-    <w:link w:val="afa"/>
+  <w:style w:type="character" w:customStyle="1" w:styleId="BalloonTextChar">
+    <w:name w:val="Balloon Text Char"/>
+    <w:basedOn w:val="DefaultParagraphFont"/>
+    <w:link w:val="BalloonText"/>
     <w:uiPriority w:val="99"/>
     <w:semiHidden/>
     <w:rsid w:val="001B7CB2"/>
@@ -17787,10 +17786,10 @@
       <w:szCs w:val="22"/>
     </w:rPr>
   </w:style>
-  <w:style w:type="paragraph" w:styleId="afc">
+  <w:style w:type="paragraph" w:styleId="Bibliography">
     <w:name w:val="Bibliography"/>
-    <w:basedOn w:val="a2"/>
-    <w:next w:val="a2"/>
+    <w:basedOn w:val="Normal"/>
+    <w:next w:val="Normal"/>
     <w:uiPriority w:val="37"/>
     <w:semiHidden/>
     <w:unhideWhenUsed/>
@@ -17800,9 +17799,9 @@
       <w:szCs w:val="40"/>
     </w:rPr>
   </w:style>
-  <w:style w:type="paragraph" w:styleId="afd">
+  <w:style w:type="paragraph" w:styleId="BlockText">
     <w:name w:val="Block Text"/>
-    <w:basedOn w:val="a2"/>
+    <w:basedOn w:val="Normal"/>
     <w:uiPriority w:val="99"/>
     <w:semiHidden/>
     <w:unhideWhenUsed/>
@@ -17824,10 +17823,10 @@
       <w:szCs w:val="40"/>
     </w:rPr>
   </w:style>
-  <w:style w:type="paragraph" w:styleId="afe">
+  <w:style w:type="paragraph" w:styleId="BodyText">
     <w:name w:val="Body Text"/>
-    <w:basedOn w:val="a2"/>
-    <w:link w:val="aff"/>
+    <w:basedOn w:val="Normal"/>
+    <w:link w:val="BodyTextChar"/>
     <w:uiPriority w:val="99"/>
     <w:semiHidden/>
     <w:unhideWhenUsed/>
@@ -17840,10 +17839,10 @@
       <w:szCs w:val="40"/>
     </w:rPr>
   </w:style>
-  <w:style w:type="character" w:customStyle="1" w:styleId="aff">
-    <w:name w:val="เนื้อความ อักขระ"/>
-    <w:basedOn w:val="a3"/>
-    <w:link w:val="afe"/>
+  <w:style w:type="character" w:customStyle="1" w:styleId="BodyTextChar">
+    <w:name w:val="Body Text Char"/>
+    <w:basedOn w:val="DefaultParagraphFont"/>
+    <w:link w:val="BodyText"/>
     <w:uiPriority w:val="99"/>
     <w:semiHidden/>
     <w:rsid w:val="001B7CB2"/>
@@ -17852,10 +17851,10 @@
       <w:szCs w:val="40"/>
     </w:rPr>
   </w:style>
-  <w:style w:type="paragraph" w:styleId="23">
+  <w:style w:type="paragraph" w:styleId="BodyText2">
     <w:name w:val="Body Text 2"/>
-    <w:basedOn w:val="a2"/>
-    <w:link w:val="24"/>
+    <w:basedOn w:val="Normal"/>
+    <w:link w:val="BodyText2Char"/>
     <w:uiPriority w:val="99"/>
     <w:semiHidden/>
     <w:unhideWhenUsed/>
@@ -17868,10 +17867,10 @@
       <w:szCs w:val="40"/>
     </w:rPr>
   </w:style>
-  <w:style w:type="character" w:customStyle="1" w:styleId="24">
-    <w:name w:val="เนื้อความ 2 อักขระ"/>
-    <w:basedOn w:val="a3"/>
-    <w:link w:val="23"/>
+  <w:style w:type="character" w:customStyle="1" w:styleId="BodyText2Char">
+    <w:name w:val="Body Text 2 Char"/>
+    <w:basedOn w:val="DefaultParagraphFont"/>
+    <w:link w:val="BodyText2"/>
     <w:uiPriority w:val="99"/>
     <w:semiHidden/>
     <w:rsid w:val="001B7CB2"/>
@@ -17880,10 +17879,10 @@
       <w:szCs w:val="40"/>
     </w:rPr>
   </w:style>
-  <w:style w:type="paragraph" w:styleId="33">
+  <w:style w:type="paragraph" w:styleId="BodyText3">
     <w:name w:val="Body Text 3"/>
-    <w:basedOn w:val="a2"/>
-    <w:link w:val="34"/>
+    <w:basedOn w:val="Normal"/>
+    <w:link w:val="BodyText3Char"/>
     <w:uiPriority w:val="99"/>
     <w:semiHidden/>
     <w:unhideWhenUsed/>
@@ -17897,10 +17896,10 @@
       <w:szCs w:val="20"/>
     </w:rPr>
   </w:style>
-  <w:style w:type="character" w:customStyle="1" w:styleId="34">
-    <w:name w:val="เนื้อความ 3 อักขระ"/>
-    <w:basedOn w:val="a3"/>
-    <w:link w:val="33"/>
+  <w:style w:type="character" w:customStyle="1" w:styleId="BodyText3Char">
+    <w:name w:val="Body Text 3 Char"/>
+    <w:basedOn w:val="DefaultParagraphFont"/>
+    <w:link w:val="BodyText3"/>
     <w:uiPriority w:val="99"/>
     <w:semiHidden/>
     <w:rsid w:val="001B7CB2"/>
@@ -17910,10 +17909,10 @@
       <w:szCs w:val="20"/>
     </w:rPr>
   </w:style>
-  <w:style w:type="paragraph" w:styleId="aff0">
+  <w:style w:type="paragraph" w:styleId="BodyTextFirstIndent">
     <w:name w:val="Body Text First Indent"/>
-    <w:basedOn w:val="afe"/>
-    <w:link w:val="aff1"/>
+    <w:basedOn w:val="BodyText"/>
+    <w:link w:val="BodyTextFirstIndentChar"/>
     <w:uiPriority w:val="99"/>
     <w:semiHidden/>
     <w:unhideWhenUsed/>
@@ -17923,10 +17922,10 @@
       <w:ind w:firstLine="360"/>
     </w:pPr>
   </w:style>
-  <w:style w:type="character" w:customStyle="1" w:styleId="aff1">
-    <w:name w:val="เยื้องย่อหน้าแรกของเนื้อความ อักขระ"/>
-    <w:basedOn w:val="aff"/>
-    <w:link w:val="aff0"/>
+  <w:style w:type="character" w:customStyle="1" w:styleId="BodyTextFirstIndentChar">
+    <w:name w:val="Body Text First Indent Char"/>
+    <w:basedOn w:val="BodyTextChar"/>
+    <w:link w:val="BodyTextFirstIndent"/>
     <w:uiPriority w:val="99"/>
     <w:semiHidden/>
     <w:rsid w:val="001B7CB2"/>
@@ -17935,10 +17934,10 @@
       <w:szCs w:val="40"/>
     </w:rPr>
   </w:style>
-  <w:style w:type="paragraph" w:styleId="aff2">
+  <w:style w:type="paragraph" w:styleId="BodyTextIndent">
     <w:name w:val="Body Text Indent"/>
-    <w:basedOn w:val="a2"/>
-    <w:link w:val="aff3"/>
+    <w:basedOn w:val="Normal"/>
+    <w:link w:val="BodyTextIndentChar"/>
     <w:uiPriority w:val="99"/>
     <w:semiHidden/>
     <w:unhideWhenUsed/>
@@ -17952,10 +17951,10 @@
       <w:szCs w:val="40"/>
     </w:rPr>
   </w:style>
-  <w:style w:type="character" w:customStyle="1" w:styleId="aff3">
-    <w:name w:val="การเยื้องเนื้อความ อักขระ"/>
-    <w:basedOn w:val="a3"/>
-    <w:link w:val="aff2"/>
+  <w:style w:type="character" w:customStyle="1" w:styleId="BodyTextIndentChar">
+    <w:name w:val="Body Text Indent Char"/>
+    <w:basedOn w:val="DefaultParagraphFont"/>
+    <w:link w:val="BodyTextIndent"/>
     <w:uiPriority w:val="99"/>
     <w:semiHidden/>
     <w:rsid w:val="001B7CB2"/>
@@ -17964,10 +17963,10 @@
       <w:szCs w:val="40"/>
     </w:rPr>
   </w:style>
-  <w:style w:type="paragraph" w:styleId="25">
+  <w:style w:type="paragraph" w:styleId="BodyTextFirstIndent2">
     <w:name w:val="Body Text First Indent 2"/>
-    <w:basedOn w:val="aff2"/>
-    <w:link w:val="26"/>
+    <w:basedOn w:val="BodyTextIndent"/>
+    <w:link w:val="BodyTextFirstIndent2Char"/>
     <w:uiPriority w:val="99"/>
     <w:semiHidden/>
     <w:unhideWhenUsed/>
@@ -17977,10 +17976,10 @@
       <w:ind w:left="360" w:firstLine="360"/>
     </w:pPr>
   </w:style>
-  <w:style w:type="character" w:customStyle="1" w:styleId="26">
-    <w:name w:val="เยื้องย่อหน้าแรกของเนื้อความ 2 อักขระ"/>
-    <w:basedOn w:val="aff3"/>
-    <w:link w:val="25"/>
+  <w:style w:type="character" w:customStyle="1" w:styleId="BodyTextFirstIndent2Char">
+    <w:name w:val="Body Text First Indent 2 Char"/>
+    <w:basedOn w:val="BodyTextIndentChar"/>
+    <w:link w:val="BodyTextFirstIndent2"/>
     <w:uiPriority w:val="99"/>
     <w:semiHidden/>
     <w:rsid w:val="001B7CB2"/>
@@ -17989,10 +17988,10 @@
       <w:szCs w:val="40"/>
     </w:rPr>
   </w:style>
-  <w:style w:type="paragraph" w:styleId="27">
+  <w:style w:type="paragraph" w:styleId="BodyTextIndent2">
     <w:name w:val="Body Text Indent 2"/>
-    <w:basedOn w:val="a2"/>
-    <w:link w:val="28"/>
+    <w:basedOn w:val="Normal"/>
+    <w:link w:val="BodyTextIndent2Char"/>
     <w:uiPriority w:val="99"/>
     <w:semiHidden/>
     <w:unhideWhenUsed/>
@@ -18006,10 +18005,10 @@
       <w:szCs w:val="40"/>
     </w:rPr>
   </w:style>
-  <w:style w:type="character" w:customStyle="1" w:styleId="28">
-    <w:name w:val="การเยื้องเนื้อความ 2 อักขระ"/>
-    <w:basedOn w:val="a3"/>
-    <w:link w:val="27"/>
+  <w:style w:type="character" w:customStyle="1" w:styleId="BodyTextIndent2Char">
+    <w:name w:val="Body Text Indent 2 Char"/>
+    <w:basedOn w:val="DefaultParagraphFont"/>
+    <w:link w:val="BodyTextIndent2"/>
     <w:uiPriority w:val="99"/>
     <w:semiHidden/>
     <w:rsid w:val="001B7CB2"/>
@@ -18018,10 +18017,10 @@
       <w:szCs w:val="40"/>
     </w:rPr>
   </w:style>
-  <w:style w:type="paragraph" w:styleId="35">
+  <w:style w:type="paragraph" w:styleId="BodyTextIndent3">
     <w:name w:val="Body Text Indent 3"/>
-    <w:basedOn w:val="a2"/>
-    <w:link w:val="36"/>
+    <w:basedOn w:val="Normal"/>
+    <w:link w:val="BodyTextIndent3Char"/>
     <w:uiPriority w:val="99"/>
     <w:semiHidden/>
     <w:unhideWhenUsed/>
@@ -18036,10 +18035,10 @@
       <w:szCs w:val="20"/>
     </w:rPr>
   </w:style>
-  <w:style w:type="character" w:customStyle="1" w:styleId="36">
-    <w:name w:val="การเยื้องเนื้อความ 3 อักขระ"/>
-    <w:basedOn w:val="a3"/>
-    <w:link w:val="35"/>
+  <w:style w:type="character" w:customStyle="1" w:styleId="BodyTextIndent3Char">
+    <w:name w:val="Body Text Indent 3 Char"/>
+    <w:basedOn w:val="DefaultParagraphFont"/>
+    <w:link w:val="BodyTextIndent3"/>
     <w:uiPriority w:val="99"/>
     <w:semiHidden/>
     <w:rsid w:val="001B7CB2"/>
@@ -18049,10 +18048,10 @@
       <w:szCs w:val="20"/>
     </w:rPr>
   </w:style>
-  <w:style w:type="paragraph" w:styleId="aff4">
+  <w:style w:type="paragraph" w:styleId="Caption">
     <w:name w:val="caption"/>
-    <w:basedOn w:val="a2"/>
-    <w:next w:val="a2"/>
+    <w:basedOn w:val="Normal"/>
+    <w:next w:val="Normal"/>
     <w:uiPriority w:val="35"/>
     <w:unhideWhenUsed/>
     <w:qFormat/>
@@ -18066,10 +18065,10 @@
       <w:color w:val="000000" w:themeColor="text1"/>
     </w:rPr>
   </w:style>
-  <w:style w:type="paragraph" w:styleId="aff5">
+  <w:style w:type="paragraph" w:styleId="Closing">
     <w:name w:val="Closing"/>
-    <w:basedOn w:val="a2"/>
-    <w:link w:val="aff6"/>
+    <w:basedOn w:val="Normal"/>
+    <w:link w:val="ClosingChar"/>
     <w:uiPriority w:val="99"/>
     <w:semiHidden/>
     <w:unhideWhenUsed/>
@@ -18083,10 +18082,10 @@
       <w:szCs w:val="40"/>
     </w:rPr>
   </w:style>
-  <w:style w:type="character" w:customStyle="1" w:styleId="aff6">
-    <w:name w:val="คำลงท้าย อักขระ"/>
-    <w:basedOn w:val="a3"/>
-    <w:link w:val="aff5"/>
+  <w:style w:type="character" w:customStyle="1" w:styleId="ClosingChar">
+    <w:name w:val="Closing Char"/>
+    <w:basedOn w:val="DefaultParagraphFont"/>
+    <w:link w:val="Closing"/>
     <w:uiPriority w:val="99"/>
     <w:semiHidden/>
     <w:rsid w:val="001B7CB2"/>
@@ -18095,10 +18094,10 @@
       <w:szCs w:val="40"/>
     </w:rPr>
   </w:style>
-  <w:style w:type="paragraph" w:styleId="aff7">
+  <w:style w:type="paragraph" w:styleId="CommentText">
     <w:name w:val="annotation text"/>
-    <w:basedOn w:val="a2"/>
-    <w:link w:val="aff8"/>
+    <w:basedOn w:val="Normal"/>
+    <w:link w:val="CommentTextChar"/>
     <w:uiPriority w:val="99"/>
     <w:semiHidden/>
     <w:unhideWhenUsed/>
@@ -18112,10 +18111,10 @@
       <w:szCs w:val="25"/>
     </w:rPr>
   </w:style>
-  <w:style w:type="character" w:customStyle="1" w:styleId="aff8">
-    <w:name w:val="ข้อความข้อคิดเห็น อักขระ"/>
-    <w:basedOn w:val="a3"/>
-    <w:link w:val="aff7"/>
+  <w:style w:type="character" w:customStyle="1" w:styleId="CommentTextChar">
+    <w:name w:val="Comment Text Char"/>
+    <w:basedOn w:val="DefaultParagraphFont"/>
+    <w:link w:val="CommentText"/>
     <w:uiPriority w:val="99"/>
     <w:semiHidden/>
     <w:rsid w:val="001B7CB2"/>
@@ -18125,11 +18124,11 @@
       <w:szCs w:val="25"/>
     </w:rPr>
   </w:style>
-  <w:style w:type="paragraph" w:styleId="aff9">
+  <w:style w:type="paragraph" w:styleId="CommentSubject">
     <w:name w:val="annotation subject"/>
-    <w:basedOn w:val="aff7"/>
-    <w:next w:val="aff7"/>
-    <w:link w:val="affa"/>
+    <w:basedOn w:val="CommentText"/>
+    <w:next w:val="CommentText"/>
+    <w:link w:val="CommentSubjectChar"/>
     <w:uiPriority w:val="99"/>
     <w:semiHidden/>
     <w:unhideWhenUsed/>
@@ -18139,10 +18138,10 @@
       <w:bCs/>
     </w:rPr>
   </w:style>
-  <w:style w:type="character" w:customStyle="1" w:styleId="affa">
-    <w:name w:val="ชื่อเรื่องของข้อคิดเห็น อักขระ"/>
-    <w:basedOn w:val="aff8"/>
-    <w:link w:val="aff9"/>
+  <w:style w:type="character" w:customStyle="1" w:styleId="CommentSubjectChar">
+    <w:name w:val="Comment Subject Char"/>
+    <w:basedOn w:val="CommentTextChar"/>
+    <w:link w:val="CommentSubject"/>
     <w:uiPriority w:val="99"/>
     <w:semiHidden/>
     <w:rsid w:val="001B7CB2"/>
@@ -18154,11 +18153,11 @@
       <w:szCs w:val="25"/>
     </w:rPr>
   </w:style>
-  <w:style w:type="paragraph" w:styleId="affb">
+  <w:style w:type="paragraph" w:styleId="Date">
     <w:name w:val="Date"/>
-    <w:basedOn w:val="a2"/>
-    <w:next w:val="a2"/>
-    <w:link w:val="affc"/>
+    <w:basedOn w:val="Normal"/>
+    <w:next w:val="Normal"/>
+    <w:link w:val="DateChar"/>
     <w:uiPriority w:val="99"/>
     <w:semiHidden/>
     <w:unhideWhenUsed/>
@@ -18168,10 +18167,10 @@
       <w:szCs w:val="40"/>
     </w:rPr>
   </w:style>
-  <w:style w:type="character" w:customStyle="1" w:styleId="affc">
-    <w:name w:val="วันที่ อักขระ"/>
-    <w:basedOn w:val="a3"/>
-    <w:link w:val="affb"/>
+  <w:style w:type="character" w:customStyle="1" w:styleId="DateChar">
+    <w:name w:val="Date Char"/>
+    <w:basedOn w:val="DefaultParagraphFont"/>
+    <w:link w:val="Date"/>
     <w:uiPriority w:val="99"/>
     <w:semiHidden/>
     <w:rsid w:val="001B7CB2"/>
@@ -18180,10 +18179,10 @@
       <w:szCs w:val="40"/>
     </w:rPr>
   </w:style>
-  <w:style w:type="paragraph" w:styleId="affd">
+  <w:style w:type="paragraph" w:styleId="DocumentMap">
     <w:name w:val="Document Map"/>
-    <w:basedOn w:val="a2"/>
-    <w:link w:val="affe"/>
+    <w:basedOn w:val="Normal"/>
+    <w:link w:val="DocumentMapChar"/>
     <w:uiPriority w:val="99"/>
     <w:semiHidden/>
     <w:unhideWhenUsed/>
@@ -18197,10 +18196,10 @@
       <w:szCs w:val="20"/>
     </w:rPr>
   </w:style>
-  <w:style w:type="character" w:customStyle="1" w:styleId="affe">
-    <w:name w:val="ผังเอกสาร อักขระ"/>
-    <w:basedOn w:val="a3"/>
-    <w:link w:val="affd"/>
+  <w:style w:type="character" w:customStyle="1" w:styleId="DocumentMapChar">
+    <w:name w:val="Document Map Char"/>
+    <w:basedOn w:val="DefaultParagraphFont"/>
+    <w:link w:val="DocumentMap"/>
     <w:uiPriority w:val="99"/>
     <w:semiHidden/>
     <w:rsid w:val="001B7CB2"/>
@@ -18210,10 +18209,10 @@
       <w:szCs w:val="20"/>
     </w:rPr>
   </w:style>
-  <w:style w:type="paragraph" w:styleId="afff">
+  <w:style w:type="paragraph" w:styleId="E-mailSignature">
     <w:name w:val="E-mail Signature"/>
-    <w:basedOn w:val="a2"/>
-    <w:link w:val="afff0"/>
+    <w:basedOn w:val="Normal"/>
+    <w:link w:val="E-mailSignatureChar"/>
     <w:uiPriority w:val="99"/>
     <w:semiHidden/>
     <w:unhideWhenUsed/>
@@ -18226,10 +18225,10 @@
       <w:szCs w:val="40"/>
     </w:rPr>
   </w:style>
-  <w:style w:type="character" w:customStyle="1" w:styleId="afff0">
-    <w:name w:val="ลายเซ็นอีเมล อักขระ"/>
-    <w:basedOn w:val="a3"/>
-    <w:link w:val="afff"/>
+  <w:style w:type="character" w:customStyle="1" w:styleId="E-mailSignatureChar">
+    <w:name w:val="E-mail Signature Char"/>
+    <w:basedOn w:val="DefaultParagraphFont"/>
+    <w:link w:val="E-mailSignature"/>
     <w:uiPriority w:val="99"/>
     <w:semiHidden/>
     <w:rsid w:val="001B7CB2"/>
@@ -18238,10 +18237,10 @@
       <w:szCs w:val="40"/>
     </w:rPr>
   </w:style>
-  <w:style w:type="paragraph" w:styleId="afff1">
+  <w:style w:type="paragraph" w:styleId="EndnoteText">
     <w:name w:val="endnote text"/>
-    <w:basedOn w:val="a2"/>
-    <w:link w:val="afff2"/>
+    <w:basedOn w:val="Normal"/>
+    <w:link w:val="EndnoteTextChar"/>
     <w:uiPriority w:val="99"/>
     <w:semiHidden/>
     <w:unhideWhenUsed/>
@@ -18255,10 +18254,10 @@
       <w:szCs w:val="25"/>
     </w:rPr>
   </w:style>
-  <w:style w:type="character" w:customStyle="1" w:styleId="afff2">
-    <w:name w:val="ข้อความอ้างอิงท้ายเรื่อง อักขระ"/>
-    <w:basedOn w:val="a3"/>
-    <w:link w:val="afff1"/>
+  <w:style w:type="character" w:customStyle="1" w:styleId="EndnoteTextChar">
+    <w:name w:val="Endnote Text Char"/>
+    <w:basedOn w:val="DefaultParagraphFont"/>
+    <w:link w:val="EndnoteText"/>
     <w:uiPriority w:val="99"/>
     <w:semiHidden/>
     <w:rsid w:val="001B7CB2"/>
@@ -18268,9 +18267,9 @@
       <w:szCs w:val="25"/>
     </w:rPr>
   </w:style>
-  <w:style w:type="paragraph" w:styleId="afff3">
+  <w:style w:type="paragraph" w:styleId="EnvelopeAddress">
     <w:name w:val="envelope address"/>
-    <w:basedOn w:val="a2"/>
+    <w:basedOn w:val="Normal"/>
     <w:uiPriority w:val="99"/>
     <w:semiHidden/>
     <w:unhideWhenUsed/>
@@ -18286,9 +18285,9 @@
       <w:szCs w:val="30"/>
     </w:rPr>
   </w:style>
-  <w:style w:type="paragraph" w:styleId="afff4">
+  <w:style w:type="paragraph" w:styleId="EnvelopeReturn">
     <w:name w:val="envelope return"/>
-    <w:basedOn w:val="a2"/>
+    <w:basedOn w:val="Normal"/>
     <w:uiPriority w:val="99"/>
     <w:semiHidden/>
     <w:unhideWhenUsed/>
@@ -18302,10 +18301,10 @@
       <w:szCs w:val="25"/>
     </w:rPr>
   </w:style>
-  <w:style w:type="paragraph" w:styleId="afff5">
+  <w:style w:type="paragraph" w:styleId="FootnoteText">
     <w:name w:val="footnote text"/>
-    <w:basedOn w:val="a2"/>
-    <w:link w:val="afff6"/>
+    <w:basedOn w:val="Normal"/>
+    <w:link w:val="FootnoteTextChar"/>
     <w:uiPriority w:val="99"/>
     <w:semiHidden/>
     <w:unhideWhenUsed/>
@@ -18319,10 +18318,10 @@
       <w:szCs w:val="25"/>
     </w:rPr>
   </w:style>
-  <w:style w:type="character" w:customStyle="1" w:styleId="afff6">
-    <w:name w:val="ข้อความเชิงอรรถ อักขระ"/>
-    <w:basedOn w:val="a3"/>
-    <w:link w:val="afff5"/>
+  <w:style w:type="character" w:customStyle="1" w:styleId="FootnoteTextChar">
+    <w:name w:val="Footnote Text Char"/>
+    <w:basedOn w:val="DefaultParagraphFont"/>
+    <w:link w:val="FootnoteText"/>
     <w:uiPriority w:val="99"/>
     <w:semiHidden/>
     <w:rsid w:val="001B7CB2"/>
@@ -18332,10 +18331,10 @@
       <w:szCs w:val="25"/>
     </w:rPr>
   </w:style>
-  <w:style w:type="paragraph" w:styleId="HTML">
+  <w:style w:type="paragraph" w:styleId="HTMLAddress">
     <w:name w:val="HTML Address"/>
-    <w:basedOn w:val="a2"/>
-    <w:link w:val="HTML0"/>
+    <w:basedOn w:val="Normal"/>
+    <w:link w:val="HTMLAddressChar"/>
     <w:uiPriority w:val="99"/>
     <w:semiHidden/>
     <w:unhideWhenUsed/>
@@ -18350,10 +18349,10 @@
       <w:szCs w:val="40"/>
     </w:rPr>
   </w:style>
-  <w:style w:type="character" w:customStyle="1" w:styleId="HTML0">
-    <w:name w:val="ที่อยู่ HTML อักขระ"/>
-    <w:basedOn w:val="a3"/>
-    <w:link w:val="HTML"/>
+  <w:style w:type="character" w:customStyle="1" w:styleId="HTMLAddressChar">
+    <w:name w:val="HTML Address Char"/>
+    <w:basedOn w:val="DefaultParagraphFont"/>
+    <w:link w:val="HTMLAddress"/>
     <w:uiPriority w:val="99"/>
     <w:semiHidden/>
     <w:rsid w:val="001B7CB2"/>
@@ -18364,10 +18363,10 @@
       <w:szCs w:val="40"/>
     </w:rPr>
   </w:style>
-  <w:style w:type="paragraph" w:styleId="HTML1">
+  <w:style w:type="paragraph" w:styleId="HTMLPreformatted">
     <w:name w:val="HTML Preformatted"/>
-    <w:basedOn w:val="a2"/>
-    <w:link w:val="HTML2"/>
+    <w:basedOn w:val="Normal"/>
+    <w:link w:val="HTMLPreformattedChar"/>
     <w:uiPriority w:val="99"/>
     <w:semiHidden/>
     <w:unhideWhenUsed/>
@@ -18381,10 +18380,10 @@
       <w:szCs w:val="25"/>
     </w:rPr>
   </w:style>
-  <w:style w:type="character" w:customStyle="1" w:styleId="HTML2">
-    <w:name w:val="HTML ที่ได้รับการจัดรูปแบบแล้ว อักขระ"/>
-    <w:basedOn w:val="a3"/>
-    <w:link w:val="HTML1"/>
+  <w:style w:type="character" w:customStyle="1" w:styleId="HTMLPreformattedChar">
+    <w:name w:val="HTML Preformatted Char"/>
+    <w:basedOn w:val="DefaultParagraphFont"/>
+    <w:link w:val="HTMLPreformatted"/>
     <w:uiPriority w:val="99"/>
     <w:semiHidden/>
     <w:rsid w:val="001B7CB2"/>
@@ -18394,10 +18393,10 @@
       <w:szCs w:val="25"/>
     </w:rPr>
   </w:style>
-  <w:style w:type="paragraph" w:styleId="11">
+  <w:style w:type="paragraph" w:styleId="Index1">
     <w:name w:val="index 1"/>
-    <w:basedOn w:val="a2"/>
-    <w:next w:val="a2"/>
+    <w:basedOn w:val="Normal"/>
+    <w:next w:val="Normal"/>
     <w:autoRedefine/>
     <w:uiPriority w:val="99"/>
     <w:semiHidden/>
@@ -18412,10 +18411,10 @@
       <w:szCs w:val="40"/>
     </w:rPr>
   </w:style>
-  <w:style w:type="paragraph" w:styleId="29">
+  <w:style w:type="paragraph" w:styleId="Index2">
     <w:name w:val="index 2"/>
-    <w:basedOn w:val="a2"/>
-    <w:next w:val="a2"/>
+    <w:basedOn w:val="Normal"/>
+    <w:next w:val="Normal"/>
     <w:autoRedefine/>
     <w:uiPriority w:val="99"/>
     <w:semiHidden/>
@@ -18430,10 +18429,10 @@
       <w:szCs w:val="40"/>
     </w:rPr>
   </w:style>
-  <w:style w:type="paragraph" w:styleId="37">
+  <w:style w:type="paragraph" w:styleId="Index3">
     <w:name w:val="index 3"/>
-    <w:basedOn w:val="a2"/>
-    <w:next w:val="a2"/>
+    <w:basedOn w:val="Normal"/>
+    <w:next w:val="Normal"/>
     <w:autoRedefine/>
     <w:uiPriority w:val="99"/>
     <w:semiHidden/>
@@ -18448,10 +18447,10 @@
       <w:szCs w:val="40"/>
     </w:rPr>
   </w:style>
-  <w:style w:type="paragraph" w:styleId="43">
+  <w:style w:type="paragraph" w:styleId="Index4">
     <w:name w:val="index 4"/>
-    <w:basedOn w:val="a2"/>
-    <w:next w:val="a2"/>
+    <w:basedOn w:val="Normal"/>
+    <w:next w:val="Normal"/>
     <w:autoRedefine/>
     <w:uiPriority w:val="99"/>
     <w:semiHidden/>
@@ -18466,10 +18465,10 @@
       <w:szCs w:val="40"/>
     </w:rPr>
   </w:style>
-  <w:style w:type="paragraph" w:styleId="53">
+  <w:style w:type="paragraph" w:styleId="Index5">
     <w:name w:val="index 5"/>
-    <w:basedOn w:val="a2"/>
-    <w:next w:val="a2"/>
+    <w:basedOn w:val="Normal"/>
+    <w:next w:val="Normal"/>
     <w:autoRedefine/>
     <w:uiPriority w:val="99"/>
     <w:semiHidden/>
@@ -18484,10 +18483,10 @@
       <w:szCs w:val="40"/>
     </w:rPr>
   </w:style>
-  <w:style w:type="paragraph" w:styleId="61">
+  <w:style w:type="paragraph" w:styleId="Index6">
     <w:name w:val="index 6"/>
-    <w:basedOn w:val="a2"/>
-    <w:next w:val="a2"/>
+    <w:basedOn w:val="Normal"/>
+    <w:next w:val="Normal"/>
     <w:autoRedefine/>
     <w:uiPriority w:val="99"/>
     <w:semiHidden/>
@@ -18502,10 +18501,10 @@
       <w:szCs w:val="40"/>
     </w:rPr>
   </w:style>
-  <w:style w:type="paragraph" w:styleId="71">
+  <w:style w:type="paragraph" w:styleId="Index7">
     <w:name w:val="index 7"/>
-    <w:basedOn w:val="a2"/>
-    <w:next w:val="a2"/>
+    <w:basedOn w:val="Normal"/>
+    <w:next w:val="Normal"/>
     <w:autoRedefine/>
     <w:uiPriority w:val="99"/>
     <w:semiHidden/>
@@ -18520,10 +18519,10 @@
       <w:szCs w:val="40"/>
     </w:rPr>
   </w:style>
-  <w:style w:type="paragraph" w:styleId="81">
+  <w:style w:type="paragraph" w:styleId="Index8">
     <w:name w:val="index 8"/>
-    <w:basedOn w:val="a2"/>
-    <w:next w:val="a2"/>
+    <w:basedOn w:val="Normal"/>
+    <w:next w:val="Normal"/>
     <w:autoRedefine/>
     <w:uiPriority w:val="99"/>
     <w:semiHidden/>
@@ -18538,10 +18537,10 @@
       <w:szCs w:val="40"/>
     </w:rPr>
   </w:style>
-  <w:style w:type="paragraph" w:styleId="91">
+  <w:style w:type="paragraph" w:styleId="Index9">
     <w:name w:val="index 9"/>
-    <w:basedOn w:val="a2"/>
-    <w:next w:val="a2"/>
+    <w:basedOn w:val="Normal"/>
+    <w:next w:val="Normal"/>
     <w:autoRedefine/>
     <w:uiPriority w:val="99"/>
     <w:semiHidden/>
@@ -18556,10 +18555,10 @@
       <w:szCs w:val="40"/>
     </w:rPr>
   </w:style>
-  <w:style w:type="paragraph" w:styleId="afff7">
+  <w:style w:type="paragraph" w:styleId="IndexHeading">
     <w:name w:val="index heading"/>
-    <w:basedOn w:val="a2"/>
-    <w:next w:val="11"/>
+    <w:basedOn w:val="Normal"/>
+    <w:next w:val="Index1"/>
     <w:uiPriority w:val="99"/>
     <w:semiHidden/>
     <w:unhideWhenUsed/>
@@ -18571,9 +18570,9 @@
       <w:szCs w:val="40"/>
     </w:rPr>
   </w:style>
-  <w:style w:type="paragraph" w:styleId="afff8">
+  <w:style w:type="paragraph" w:styleId="List">
     <w:name w:val="List"/>
-    <w:basedOn w:val="a2"/>
+    <w:basedOn w:val="Normal"/>
     <w:uiPriority w:val="99"/>
     <w:semiHidden/>
     <w:unhideWhenUsed/>
@@ -18587,9 +18586,9 @@
       <w:szCs w:val="40"/>
     </w:rPr>
   </w:style>
-  <w:style w:type="paragraph" w:styleId="2a">
+  <w:style w:type="paragraph" w:styleId="List2">
     <w:name w:val="List 2"/>
-    <w:basedOn w:val="a2"/>
+    <w:basedOn w:val="Normal"/>
     <w:uiPriority w:val="99"/>
     <w:semiHidden/>
     <w:unhideWhenUsed/>
@@ -18603,9 +18602,9 @@
       <w:szCs w:val="40"/>
     </w:rPr>
   </w:style>
-  <w:style w:type="paragraph" w:styleId="38">
+  <w:style w:type="paragraph" w:styleId="List3">
     <w:name w:val="List 3"/>
-    <w:basedOn w:val="a2"/>
+    <w:basedOn w:val="Normal"/>
     <w:uiPriority w:val="99"/>
     <w:semiHidden/>
     <w:unhideWhenUsed/>
@@ -18619,9 +18618,9 @@
       <w:szCs w:val="40"/>
     </w:rPr>
   </w:style>
-  <w:style w:type="paragraph" w:styleId="44">
+  <w:style w:type="paragraph" w:styleId="List4">
     <w:name w:val="List 4"/>
-    <w:basedOn w:val="a2"/>
+    <w:basedOn w:val="Normal"/>
     <w:uiPriority w:val="99"/>
     <w:semiHidden/>
     <w:unhideWhenUsed/>
@@ -18635,9 +18634,9 @@
       <w:szCs w:val="40"/>
     </w:rPr>
   </w:style>
-  <w:style w:type="paragraph" w:styleId="54">
+  <w:style w:type="paragraph" w:styleId="List5">
     <w:name w:val="List 5"/>
-    <w:basedOn w:val="a2"/>
+    <w:basedOn w:val="Normal"/>
     <w:uiPriority w:val="99"/>
     <w:semiHidden/>
     <w:unhideWhenUsed/>
@@ -18651,9 +18650,9 @@
       <w:szCs w:val="40"/>
     </w:rPr>
   </w:style>
-  <w:style w:type="paragraph" w:styleId="a0">
+  <w:style w:type="paragraph" w:styleId="ListBullet">
     <w:name w:val="List Bullet"/>
-    <w:basedOn w:val="a2"/>
+    <w:basedOn w:val="Normal"/>
     <w:uiPriority w:val="99"/>
     <w:semiHidden/>
     <w:unhideWhenUsed/>
@@ -18669,9 +18668,9 @@
       <w:szCs w:val="40"/>
     </w:rPr>
   </w:style>
-  <w:style w:type="paragraph" w:styleId="20">
+  <w:style w:type="paragraph" w:styleId="ListBullet2">
     <w:name w:val="List Bullet 2"/>
-    <w:basedOn w:val="a2"/>
+    <w:basedOn w:val="Normal"/>
     <w:uiPriority w:val="99"/>
     <w:semiHidden/>
     <w:unhideWhenUsed/>
@@ -18687,9 +18686,9 @@
       <w:szCs w:val="40"/>
     </w:rPr>
   </w:style>
-  <w:style w:type="paragraph" w:styleId="30">
+  <w:style w:type="paragraph" w:styleId="ListBullet3">
     <w:name w:val="List Bullet 3"/>
-    <w:basedOn w:val="a2"/>
+    <w:basedOn w:val="Normal"/>
     <w:uiPriority w:val="99"/>
     <w:semiHidden/>
     <w:unhideWhenUsed/>
@@ -18705,9 +18704,9 @@
       <w:szCs w:val="40"/>
     </w:rPr>
   </w:style>
-  <w:style w:type="paragraph" w:styleId="40">
+  <w:style w:type="paragraph" w:styleId="ListBullet4">
     <w:name w:val="List Bullet 4"/>
-    <w:basedOn w:val="a2"/>
+    <w:basedOn w:val="Normal"/>
     <w:uiPriority w:val="99"/>
     <w:semiHidden/>
     <w:unhideWhenUsed/>
@@ -18723,9 +18722,9 @@
       <w:szCs w:val="40"/>
     </w:rPr>
   </w:style>
-  <w:style w:type="paragraph" w:styleId="50">
+  <w:style w:type="paragraph" w:styleId="ListBullet5">
     <w:name w:val="List Bullet 5"/>
-    <w:basedOn w:val="a2"/>
+    <w:basedOn w:val="Normal"/>
     <w:uiPriority w:val="99"/>
     <w:semiHidden/>
     <w:unhideWhenUsed/>
@@ -18741,9 +18740,9 @@
       <w:szCs w:val="40"/>
     </w:rPr>
   </w:style>
-  <w:style w:type="paragraph" w:styleId="afff9">
+  <w:style w:type="paragraph" w:styleId="ListContinue">
     <w:name w:val="List Continue"/>
-    <w:basedOn w:val="a2"/>
+    <w:basedOn w:val="Normal"/>
     <w:uiPriority w:val="99"/>
     <w:semiHidden/>
     <w:unhideWhenUsed/>
@@ -18758,9 +18757,9 @@
       <w:szCs w:val="40"/>
     </w:rPr>
   </w:style>
-  <w:style w:type="paragraph" w:styleId="2b">
+  <w:style w:type="paragraph" w:styleId="ListContinue2">
     <w:name w:val="List Continue 2"/>
-    <w:basedOn w:val="a2"/>
+    <w:basedOn w:val="Normal"/>
     <w:uiPriority w:val="99"/>
     <w:semiHidden/>
     <w:unhideWhenUsed/>
@@ -18775,9 +18774,9 @@
       <w:szCs w:val="40"/>
     </w:rPr>
   </w:style>
-  <w:style w:type="paragraph" w:styleId="39">
+  <w:style w:type="paragraph" w:styleId="ListContinue3">
     <w:name w:val="List Continue 3"/>
-    <w:basedOn w:val="a2"/>
+    <w:basedOn w:val="Normal"/>
     <w:uiPriority w:val="99"/>
     <w:semiHidden/>
     <w:unhideWhenUsed/>
@@ -18792,9 +18791,9 @@
       <w:szCs w:val="40"/>
     </w:rPr>
   </w:style>
-  <w:style w:type="paragraph" w:styleId="45">
+  <w:style w:type="paragraph" w:styleId="ListContinue4">
     <w:name w:val="List Continue 4"/>
-    <w:basedOn w:val="a2"/>
+    <w:basedOn w:val="Normal"/>
     <w:uiPriority w:val="99"/>
     <w:semiHidden/>
     <w:unhideWhenUsed/>
@@ -18809,9 +18808,9 @@
       <w:szCs w:val="40"/>
     </w:rPr>
   </w:style>
-  <w:style w:type="paragraph" w:styleId="55">
+  <w:style w:type="paragraph" w:styleId="ListContinue5">
     <w:name w:val="List Continue 5"/>
-    <w:basedOn w:val="a2"/>
+    <w:basedOn w:val="Normal"/>
     <w:uiPriority w:val="99"/>
     <w:semiHidden/>
     <w:unhideWhenUsed/>
@@ -18826,9 +18825,9 @@
       <w:szCs w:val="40"/>
     </w:rPr>
   </w:style>
-  <w:style w:type="paragraph" w:styleId="a">
+  <w:style w:type="paragraph" w:styleId="ListNumber">
     <w:name w:val="List Number"/>
-    <w:basedOn w:val="a2"/>
+    <w:basedOn w:val="Normal"/>
     <w:uiPriority w:val="99"/>
     <w:semiHidden/>
     <w:unhideWhenUsed/>
@@ -18844,9 +18843,9 @@
       <w:szCs w:val="40"/>
     </w:rPr>
   </w:style>
-  <w:style w:type="paragraph" w:styleId="2">
+  <w:style w:type="paragraph" w:styleId="ListNumber2">
     <w:name w:val="List Number 2"/>
-    <w:basedOn w:val="a2"/>
+    <w:basedOn w:val="Normal"/>
     <w:uiPriority w:val="99"/>
     <w:semiHidden/>
     <w:unhideWhenUsed/>
@@ -18862,9 +18861,9 @@
       <w:szCs w:val="40"/>
     </w:rPr>
   </w:style>
-  <w:style w:type="paragraph" w:styleId="3">
+  <w:style w:type="paragraph" w:styleId="ListNumber3">
     <w:name w:val="List Number 3"/>
-    <w:basedOn w:val="a2"/>
+    <w:basedOn w:val="Normal"/>
     <w:uiPriority w:val="99"/>
     <w:semiHidden/>
     <w:unhideWhenUsed/>
@@ -18880,9 +18879,9 @@
       <w:szCs w:val="40"/>
     </w:rPr>
   </w:style>
-  <w:style w:type="paragraph" w:styleId="4">
+  <w:style w:type="paragraph" w:styleId="ListNumber4">
     <w:name w:val="List Number 4"/>
-    <w:basedOn w:val="a2"/>
+    <w:basedOn w:val="Normal"/>
     <w:uiPriority w:val="99"/>
     <w:semiHidden/>
     <w:unhideWhenUsed/>
@@ -18898,9 +18897,9 @@
       <w:szCs w:val="40"/>
     </w:rPr>
   </w:style>
-  <w:style w:type="paragraph" w:styleId="5">
+  <w:style w:type="paragraph" w:styleId="ListNumber5">
     <w:name w:val="List Number 5"/>
-    <w:basedOn w:val="a2"/>
+    <w:basedOn w:val="Normal"/>
     <w:uiPriority w:val="99"/>
     <w:semiHidden/>
     <w:unhideWhenUsed/>
@@ -18916,9 +18915,9 @@
       <w:szCs w:val="40"/>
     </w:rPr>
   </w:style>
-  <w:style w:type="paragraph" w:styleId="afffa">
+  <w:style w:type="paragraph" w:styleId="MacroText">
     <w:name w:val="macro"/>
-    <w:link w:val="afffb"/>
+    <w:link w:val="MacroTextChar"/>
     <w:uiPriority w:val="99"/>
     <w:semiHidden/>
     <w:unhideWhenUsed/>
@@ -18943,10 +18942,10 @@
       <w:szCs w:val="25"/>
     </w:rPr>
   </w:style>
-  <w:style w:type="character" w:customStyle="1" w:styleId="afffb">
-    <w:name w:val="ข้อความแมโคร อักขระ"/>
-    <w:basedOn w:val="a3"/>
-    <w:link w:val="afffa"/>
+  <w:style w:type="character" w:customStyle="1" w:styleId="MacroTextChar">
+    <w:name w:val="Macro Text Char"/>
+    <w:basedOn w:val="DefaultParagraphFont"/>
+    <w:link w:val="MacroText"/>
     <w:uiPriority w:val="99"/>
     <w:semiHidden/>
     <w:rsid w:val="001B7CB2"/>
@@ -18956,10 +18955,10 @@
       <w:szCs w:val="25"/>
     </w:rPr>
   </w:style>
-  <w:style w:type="paragraph" w:styleId="afffc">
+  <w:style w:type="paragraph" w:styleId="MessageHeader">
     <w:name w:val="Message Header"/>
-    <w:basedOn w:val="a2"/>
-    <w:link w:val="afffd"/>
+    <w:basedOn w:val="Normal"/>
+    <w:link w:val="MessageHeaderChar"/>
     <w:uiPriority w:val="99"/>
     <w:semiHidden/>
     <w:unhideWhenUsed/>
@@ -18981,10 +18980,10 @@
       <w:szCs w:val="30"/>
     </w:rPr>
   </w:style>
-  <w:style w:type="character" w:customStyle="1" w:styleId="afffd">
-    <w:name w:val="ส่วนหัวข้อความ อักขระ"/>
-    <w:basedOn w:val="a3"/>
-    <w:link w:val="afffc"/>
+  <w:style w:type="character" w:customStyle="1" w:styleId="MessageHeaderChar">
+    <w:name w:val="Message Header Char"/>
+    <w:basedOn w:val="DefaultParagraphFont"/>
+    <w:link w:val="MessageHeader"/>
     <w:uiPriority w:val="99"/>
     <w:semiHidden/>
     <w:rsid w:val="001B7CB2"/>
@@ -18995,7 +18994,7 @@
       <w:shd w:val="pct20" w:color="auto" w:fill="auto"/>
     </w:rPr>
   </w:style>
-  <w:style w:type="paragraph" w:styleId="afffe">
+  <w:style w:type="paragraph" w:styleId="NoSpacing">
     <w:name w:val="No Spacing"/>
     <w:uiPriority w:val="1"/>
     <w:qFormat/>
@@ -19008,9 +19007,9 @@
       <w:szCs w:val="40"/>
     </w:rPr>
   </w:style>
-  <w:style w:type="paragraph" w:styleId="affff">
+  <w:style w:type="paragraph" w:styleId="NormalWeb">
     <w:name w:val="Normal (Web)"/>
-    <w:basedOn w:val="a2"/>
+    <w:basedOn w:val="Normal"/>
     <w:uiPriority w:val="99"/>
     <w:semiHidden/>
     <w:unhideWhenUsed/>
@@ -19021,9 +19020,9 @@
       <w:szCs w:val="30"/>
     </w:rPr>
   </w:style>
-  <w:style w:type="paragraph" w:styleId="affff0">
+  <w:style w:type="paragraph" w:styleId="NormalIndent">
     <w:name w:val="Normal Indent"/>
-    <w:basedOn w:val="a2"/>
+    <w:basedOn w:val="Normal"/>
     <w:uiPriority w:val="99"/>
     <w:semiHidden/>
     <w:unhideWhenUsed/>
@@ -19036,11 +19035,11 @@
       <w:szCs w:val="40"/>
     </w:rPr>
   </w:style>
-  <w:style w:type="paragraph" w:styleId="affff1">
+  <w:style w:type="paragraph" w:styleId="NoteHeading">
     <w:name w:val="Note Heading"/>
-    <w:basedOn w:val="a2"/>
-    <w:next w:val="a2"/>
-    <w:link w:val="affff2"/>
+    <w:basedOn w:val="Normal"/>
+    <w:next w:val="Normal"/>
+    <w:link w:val="NoteHeadingChar"/>
     <w:uiPriority w:val="99"/>
     <w:semiHidden/>
     <w:unhideWhenUsed/>
@@ -19053,10 +19052,10 @@
       <w:szCs w:val="40"/>
     </w:rPr>
   </w:style>
-  <w:style w:type="character" w:customStyle="1" w:styleId="affff2">
-    <w:name w:val="ส่วนหัวของบันทึกย่อ อักขระ"/>
-    <w:basedOn w:val="a3"/>
-    <w:link w:val="affff1"/>
+  <w:style w:type="character" w:customStyle="1" w:styleId="NoteHeadingChar">
+    <w:name w:val="Note Heading Char"/>
+    <w:basedOn w:val="DefaultParagraphFont"/>
+    <w:link w:val="NoteHeading"/>
     <w:uiPriority w:val="99"/>
     <w:semiHidden/>
     <w:rsid w:val="001B7CB2"/>
@@ -19065,10 +19064,10 @@
       <w:szCs w:val="40"/>
     </w:rPr>
   </w:style>
-  <w:style w:type="paragraph" w:styleId="affff3">
+  <w:style w:type="paragraph" w:styleId="PlainText">
     <w:name w:val="Plain Text"/>
-    <w:basedOn w:val="a2"/>
-    <w:link w:val="affff4"/>
+    <w:basedOn w:val="Normal"/>
+    <w:link w:val="PlainTextChar"/>
     <w:uiPriority w:val="99"/>
     <w:semiHidden/>
     <w:unhideWhenUsed/>
@@ -19082,10 +19081,10 @@
       <w:szCs w:val="26"/>
     </w:rPr>
   </w:style>
-  <w:style w:type="character" w:customStyle="1" w:styleId="affff4">
-    <w:name w:val="ข้อความธรรมดา อักขระ"/>
-    <w:basedOn w:val="a3"/>
-    <w:link w:val="affff3"/>
+  <w:style w:type="character" w:customStyle="1" w:styleId="PlainTextChar">
+    <w:name w:val="Plain Text Char"/>
+    <w:basedOn w:val="DefaultParagraphFont"/>
+    <w:link w:val="PlainText"/>
     <w:uiPriority w:val="99"/>
     <w:semiHidden/>
     <w:rsid w:val="001B7CB2"/>
@@ -19095,11 +19094,11 @@
       <w:szCs w:val="26"/>
     </w:rPr>
   </w:style>
-  <w:style w:type="paragraph" w:styleId="affff5">
+  <w:style w:type="paragraph" w:styleId="Salutation">
     <w:name w:val="Salutation"/>
-    <w:basedOn w:val="a2"/>
-    <w:next w:val="a2"/>
-    <w:link w:val="affff6"/>
+    <w:basedOn w:val="Normal"/>
+    <w:next w:val="Normal"/>
+    <w:link w:val="SalutationChar"/>
     <w:uiPriority w:val="99"/>
     <w:semiHidden/>
     <w:unhideWhenUsed/>
@@ -19109,10 +19108,10 @@
       <w:szCs w:val="40"/>
     </w:rPr>
   </w:style>
-  <w:style w:type="character" w:customStyle="1" w:styleId="affff6">
-    <w:name w:val="คำขึ้นต้นจดหมาย อักขระ"/>
-    <w:basedOn w:val="a3"/>
-    <w:link w:val="affff5"/>
+  <w:style w:type="character" w:customStyle="1" w:styleId="SalutationChar">
+    <w:name w:val="Salutation Char"/>
+    <w:basedOn w:val="DefaultParagraphFont"/>
+    <w:link w:val="Salutation"/>
     <w:uiPriority w:val="99"/>
     <w:semiHidden/>
     <w:rsid w:val="001B7CB2"/>
@@ -19121,10 +19120,10 @@
       <w:szCs w:val="40"/>
     </w:rPr>
   </w:style>
-  <w:style w:type="paragraph" w:styleId="affff7">
+  <w:style w:type="paragraph" w:styleId="Signature">
     <w:name w:val="Signature"/>
-    <w:basedOn w:val="a2"/>
-    <w:link w:val="affff8"/>
+    <w:basedOn w:val="Normal"/>
+    <w:link w:val="SignatureChar"/>
     <w:uiPriority w:val="99"/>
     <w:semiHidden/>
     <w:unhideWhenUsed/>
@@ -19138,10 +19137,10 @@
       <w:szCs w:val="40"/>
     </w:rPr>
   </w:style>
-  <w:style w:type="character" w:customStyle="1" w:styleId="affff8">
-    <w:name w:val="ลายเซ็น อักขระ"/>
-    <w:basedOn w:val="a3"/>
-    <w:link w:val="affff7"/>
+  <w:style w:type="character" w:customStyle="1" w:styleId="SignatureChar">
+    <w:name w:val="Signature Char"/>
+    <w:basedOn w:val="DefaultParagraphFont"/>
+    <w:link w:val="Signature"/>
     <w:uiPriority w:val="99"/>
     <w:semiHidden/>
     <w:rsid w:val="001B7CB2"/>
@@ -19150,10 +19149,10 @@
       <w:szCs w:val="40"/>
     </w:rPr>
   </w:style>
-  <w:style w:type="paragraph" w:styleId="affff9">
+  <w:style w:type="paragraph" w:styleId="TableofAuthorities">
     <w:name w:val="table of authorities"/>
-    <w:basedOn w:val="a2"/>
-    <w:next w:val="a2"/>
+    <w:basedOn w:val="Normal"/>
+    <w:next w:val="Normal"/>
     <w:uiPriority w:val="99"/>
     <w:semiHidden/>
     <w:unhideWhenUsed/>
@@ -19167,10 +19166,10 @@
       <w:szCs w:val="40"/>
     </w:rPr>
   </w:style>
-  <w:style w:type="paragraph" w:styleId="affffa">
+  <w:style w:type="paragraph" w:styleId="TableofFigures">
     <w:name w:val="table of figures"/>
-    <w:basedOn w:val="a2"/>
-    <w:next w:val="a2"/>
+    <w:basedOn w:val="Normal"/>
+    <w:next w:val="Normal"/>
     <w:uiPriority w:val="99"/>
     <w:semiHidden/>
     <w:unhideWhenUsed/>
@@ -19183,10 +19182,10 @@
       <w:szCs w:val="40"/>
     </w:rPr>
   </w:style>
-  <w:style w:type="paragraph" w:styleId="affffb">
+  <w:style w:type="paragraph" w:styleId="TOAHeading">
     <w:name w:val="toa heading"/>
-    <w:basedOn w:val="a2"/>
-    <w:next w:val="a2"/>
+    <w:basedOn w:val="Normal"/>
+    <w:next w:val="Normal"/>
     <w:uiPriority w:val="99"/>
     <w:semiHidden/>
     <w:unhideWhenUsed/>
@@ -19202,10 +19201,10 @@
       <w:szCs w:val="30"/>
     </w:rPr>
   </w:style>
-  <w:style w:type="paragraph" w:styleId="12">
+  <w:style w:type="paragraph" w:styleId="TOC1">
     <w:name w:val="toc 1"/>
-    <w:basedOn w:val="a2"/>
-    <w:next w:val="a2"/>
+    <w:basedOn w:val="Normal"/>
+    <w:next w:val="Normal"/>
     <w:autoRedefine/>
     <w:uiPriority w:val="39"/>
     <w:semiHidden/>
@@ -19219,10 +19218,10 @@
       <w:szCs w:val="40"/>
     </w:rPr>
   </w:style>
-  <w:style w:type="paragraph" w:styleId="2c">
+  <w:style w:type="paragraph" w:styleId="TOC2">
     <w:name w:val="toc 2"/>
-    <w:basedOn w:val="a2"/>
-    <w:next w:val="a2"/>
+    <w:basedOn w:val="Normal"/>
+    <w:next w:val="Normal"/>
     <w:autoRedefine/>
     <w:uiPriority w:val="39"/>
     <w:semiHidden/>
@@ -19237,10 +19236,10 @@
       <w:szCs w:val="40"/>
     </w:rPr>
   </w:style>
-  <w:style w:type="paragraph" w:styleId="3a">
+  <w:style w:type="paragraph" w:styleId="TOC3">
     <w:name w:val="toc 3"/>
-    <w:basedOn w:val="a2"/>
-    <w:next w:val="a2"/>
+    <w:basedOn w:val="Normal"/>
+    <w:next w:val="Normal"/>
     <w:autoRedefine/>
     <w:uiPriority w:val="39"/>
     <w:semiHidden/>
@@ -19255,10 +19254,10 @@
       <w:szCs w:val="40"/>
     </w:rPr>
   </w:style>
-  <w:style w:type="paragraph" w:styleId="46">
+  <w:style w:type="paragraph" w:styleId="TOC4">
     <w:name w:val="toc 4"/>
-    <w:basedOn w:val="a2"/>
-    <w:next w:val="a2"/>
+    <w:basedOn w:val="Normal"/>
+    <w:next w:val="Normal"/>
     <w:autoRedefine/>
     <w:uiPriority w:val="39"/>
     <w:semiHidden/>
@@ -19273,10 +19272,10 @@
       <w:szCs w:val="40"/>
     </w:rPr>
   </w:style>
-  <w:style w:type="paragraph" w:styleId="56">
+  <w:style w:type="paragraph" w:styleId="TOC5">
     <w:name w:val="toc 5"/>
-    <w:basedOn w:val="a2"/>
-    <w:next w:val="a2"/>
+    <w:basedOn w:val="Normal"/>
+    <w:next w:val="Normal"/>
     <w:autoRedefine/>
     <w:uiPriority w:val="39"/>
     <w:semiHidden/>
@@ -19291,10 +19290,10 @@
       <w:szCs w:val="40"/>
     </w:rPr>
   </w:style>
-  <w:style w:type="paragraph" w:styleId="62">
+  <w:style w:type="paragraph" w:styleId="TOC6">
     <w:name w:val="toc 6"/>
-    <w:basedOn w:val="a2"/>
-    <w:next w:val="a2"/>
+    <w:basedOn w:val="Normal"/>
+    <w:next w:val="Normal"/>
     <w:autoRedefine/>
     <w:uiPriority w:val="39"/>
     <w:semiHidden/>
@@ -19309,10 +19308,10 @@
       <w:szCs w:val="40"/>
     </w:rPr>
   </w:style>
-  <w:style w:type="paragraph" w:styleId="72">
+  <w:style w:type="paragraph" w:styleId="TOC7">
     <w:name w:val="toc 7"/>
-    <w:basedOn w:val="a2"/>
-    <w:next w:val="a2"/>
+    <w:basedOn w:val="Normal"/>
+    <w:next w:val="Normal"/>
     <w:autoRedefine/>
     <w:uiPriority w:val="39"/>
     <w:semiHidden/>
@@ -19327,10 +19326,10 @@
       <w:szCs w:val="40"/>
     </w:rPr>
   </w:style>
-  <w:style w:type="paragraph" w:styleId="82">
+  <w:style w:type="paragraph" w:styleId="TOC8">
     <w:name w:val="toc 8"/>
-    <w:basedOn w:val="a2"/>
-    <w:next w:val="a2"/>
+    <w:basedOn w:val="Normal"/>
+    <w:next w:val="Normal"/>
     <w:autoRedefine/>
     <w:uiPriority w:val="39"/>
     <w:semiHidden/>
@@ -19345,10 +19344,10 @@
       <w:szCs w:val="40"/>
     </w:rPr>
   </w:style>
-  <w:style w:type="paragraph" w:styleId="92">
+  <w:style w:type="paragraph" w:styleId="TOC9">
     <w:name w:val="toc 9"/>
-    <w:basedOn w:val="a2"/>
-    <w:next w:val="a2"/>
+    <w:basedOn w:val="Normal"/>
+    <w:next w:val="Normal"/>
     <w:autoRedefine/>
     <w:uiPriority w:val="39"/>
     <w:semiHidden/>
@@ -19363,10 +19362,10 @@
       <w:szCs w:val="40"/>
     </w:rPr>
   </w:style>
-  <w:style w:type="paragraph" w:styleId="affffc">
+  <w:style w:type="paragraph" w:styleId="TOCHeading">
     <w:name w:val="TOC Heading"/>
-    <w:basedOn w:val="1"/>
-    <w:next w:val="a2"/>
+    <w:basedOn w:val="Heading1"/>
+    <w:next w:val="Normal"/>
     <w:uiPriority w:val="39"/>
     <w:semiHidden/>
     <w:unhideWhenUsed/>
@@ -19387,7 +19386,7 @@
 <file path=word/charts/chart1.xml><?xml version="1.0" encoding="utf-8"?>
 <c:chartSpace xmlns:c="http://schemas.openxmlformats.org/drawingml/2006/chart" xmlns:a="http://schemas.openxmlformats.org/drawingml/2006/main" xmlns:r="http://schemas.openxmlformats.org/officeDocument/2006/relationships" xmlns:c16r2="http://schemas.microsoft.com/office/drawing/2015/06/chart">
   <c:date1904 val="0"/>
-  <c:lang val="th-TH"/>
+  <c:lang val="en-US"/>
   <c:roundedCorners val="0"/>
   <mc:AlternateContent xmlns:mc="http://schemas.openxmlformats.org/markup-compatibility/2006">
     <mc:Choice xmlns:c14="http://schemas.microsoft.com/office/drawing/2007/8/2/chart" Requires="c14">
@@ -19870,7 +19869,7 @@
 <file path=word/charts/chart2.xml><?xml version="1.0" encoding="utf-8"?>
 <c:chartSpace xmlns:c="http://schemas.openxmlformats.org/drawingml/2006/chart" xmlns:a="http://schemas.openxmlformats.org/drawingml/2006/main" xmlns:r="http://schemas.openxmlformats.org/officeDocument/2006/relationships" xmlns:c16r2="http://schemas.microsoft.com/office/drawing/2015/06/chart">
   <c:date1904 val="0"/>
-  <c:lang val="th-TH"/>
+  <c:lang val="en-US"/>
   <c:roundedCorners val="0"/>
   <mc:AlternateContent xmlns:mc="http://schemas.openxmlformats.org/markup-compatibility/2006">
     <mc:Choice xmlns:c14="http://schemas.microsoft.com/office/drawing/2007/8/2/chart" Requires="c14">
@@ -20348,7 +20347,7 @@
 <file path=word/charts/chart3.xml><?xml version="1.0" encoding="utf-8"?>
 <c:chartSpace xmlns:c="http://schemas.openxmlformats.org/drawingml/2006/chart" xmlns:a="http://schemas.openxmlformats.org/drawingml/2006/main" xmlns:r="http://schemas.openxmlformats.org/officeDocument/2006/relationships" xmlns:c16r2="http://schemas.microsoft.com/office/drawing/2015/06/chart">
   <c:date1904 val="0"/>
-  <c:lang val="th-TH"/>
+  <c:lang val="en-US"/>
   <c:roundedCorners val="0"/>
   <mc:AlternateContent xmlns:mc="http://schemas.openxmlformats.org/markup-compatibility/2006">
     <mc:Choice xmlns:c14="http://schemas.microsoft.com/office/drawing/2007/8/2/chart" Requires="c14">
@@ -20822,7 +20821,7 @@
 <file path=word/charts/chart4.xml><?xml version="1.0" encoding="utf-8"?>
 <c:chartSpace xmlns:c="http://schemas.openxmlformats.org/drawingml/2006/chart" xmlns:a="http://schemas.openxmlformats.org/drawingml/2006/main" xmlns:r="http://schemas.openxmlformats.org/officeDocument/2006/relationships" xmlns:c16r2="http://schemas.microsoft.com/office/drawing/2015/06/chart">
   <c:date1904 val="0"/>
-  <c:lang val="th-TH"/>
+  <c:lang val="en-US"/>
   <c:roundedCorners val="0"/>
   <mc:AlternateContent xmlns:mc="http://schemas.openxmlformats.org/markup-compatibility/2006">
     <mc:Choice xmlns:c14="http://schemas.microsoft.com/office/drawing/2007/8/2/chart" Requires="c14">
@@ -21281,7 +21280,7 @@
 <file path=word/charts/chart5.xml><?xml version="1.0" encoding="utf-8"?>
 <c:chartSpace xmlns:c="http://schemas.openxmlformats.org/drawingml/2006/chart" xmlns:a="http://schemas.openxmlformats.org/drawingml/2006/main" xmlns:r="http://schemas.openxmlformats.org/officeDocument/2006/relationships" xmlns:c16r2="http://schemas.microsoft.com/office/drawing/2015/06/chart">
   <c:date1904 val="0"/>
-  <c:lang val="th-TH"/>
+  <c:lang val="en-US"/>
   <c:roundedCorners val="0"/>
   <mc:AlternateContent xmlns:mc="http://schemas.openxmlformats.org/markup-compatibility/2006">
     <mc:Choice xmlns:c14="http://schemas.microsoft.com/office/drawing/2007/8/2/chart" Requires="c14">
@@ -24804,12 +24803,7 @@
 </file>
 
 <file path=customXml/item1.xml><?xml version="1.0" encoding="utf-8"?>
-<?mso-contentType ?>
-<FormTemplates xmlns="http://schemas.microsoft.com/sharepoint/v3/contenttype/forms">
-  <Display>DocumentLibraryForm</Display>
-  <Edit>DocumentLibraryForm</Edit>
-  <New>DocumentLibraryForm</New>
-</FormTemplates>
+<b:Sources xmlns:b="http://schemas.openxmlformats.org/officeDocument/2006/bibliography" xmlns="http://schemas.openxmlformats.org/officeDocument/2006/bibliography" SelectedStyle="\APASixthEditionOfficeOnline.xsl" StyleName="APA" Version="6"/>
 </file>
 
 <file path=customXml/item2.xml><?xml version="1.0" encoding="utf-8"?>
@@ -24821,7 +24815,12 @@
 </file>
 
 <file path=customXml/item3.xml><?xml version="1.0" encoding="utf-8"?>
-<b:Sources xmlns:b="http://schemas.openxmlformats.org/officeDocument/2006/bibliography" xmlns="http://schemas.openxmlformats.org/officeDocument/2006/bibliography" SelectedStyle="\APASixthEditionOfficeOnline.xsl" StyleName="APA" Version="6"/>
+<?mso-contentType ?>
+<FormTemplates xmlns="http://schemas.microsoft.com/sharepoint/v3/contenttype/forms">
+  <Display>DocumentLibraryForm</Display>
+  <Edit>DocumentLibraryForm</Edit>
+  <New>DocumentLibraryForm</New>
+</FormTemplates>
 </file>
 
 <file path=customXml/item4.xml><?xml version="1.0" encoding="utf-8"?>
@@ -24981,9 +24980,9 @@
 </file>
 
 <file path=customXml/itemProps1.xml><?xml version="1.0" encoding="utf-8"?>
-<ds:datastoreItem xmlns:ds="http://schemas.openxmlformats.org/officeDocument/2006/customXml" ds:itemID="{FB6E50C7-B161-410D-82A0-50E58A6390FA}">
+<ds:datastoreItem xmlns:ds="http://schemas.openxmlformats.org/officeDocument/2006/customXml" ds:itemID="{95FB0139-A545-47E0-8C35-69BE14593E77}">
   <ds:schemaRefs>
-    <ds:schemaRef ds:uri="http://schemas.microsoft.com/sharepoint/v3/contenttype/forms"/>
+    <ds:schemaRef ds:uri="http://schemas.openxmlformats.org/officeDocument/2006/bibliography"/>
   </ds:schemaRefs>
 </ds:datastoreItem>
 </file>
@@ -24999,9 +24998,9 @@
 </file>
 
 <file path=customXml/itemProps3.xml><?xml version="1.0" encoding="utf-8"?>
-<ds:datastoreItem xmlns:ds="http://schemas.openxmlformats.org/officeDocument/2006/customXml" ds:itemID="{95FB0139-A545-47E0-8C35-69BE14593E77}">
+<ds:datastoreItem xmlns:ds="http://schemas.openxmlformats.org/officeDocument/2006/customXml" ds:itemID="{FB6E50C7-B161-410D-82A0-50E58A6390FA}">
   <ds:schemaRefs>
-    <ds:schemaRef ds:uri="http://schemas.openxmlformats.org/officeDocument/2006/bibliography"/>
+    <ds:schemaRef ds:uri="http://schemas.microsoft.com/sharepoint/v3/contenttype/forms"/>
   </ds:schemaRefs>
 </ds:datastoreItem>
 </file>

</xml_diff>